<commit_message>
Polish design document formatting
</commit_message>
<xml_diff>
--- a/docs/医研导师设计说明.docx
+++ b/docs/医研导师设计说明.docx
@@ -6,616 +6,977 @@
       <w:pPr>
         <w:pStyle w:val="Title"/>
         <w:jc w:val="center"/>
+        <w:snapToGrid w:val="0"/>
       </w:pPr>
       <w:r>
-        <w:rPr>
-          <w:rFonts w:ascii="黑体" w:hAnsi="黑体" w:eastAsia="黑体"/>
-          <w:b/>
-          <w:sz w:val="32"/>
-        </w:rPr>
-        <w:t>医研导师：面向医学科研初学者的智能体设计说明</w:t>
+        <w:t>医研导师——</w:t>
+        <w:br/>
       </w:r>
-    </w:p>
-    <w:p>
       <w:r>
-        <w:t>我最近做的项目叫 **医研导师（Med Research Mentor）**，面向医学科研初学者。现在已经有完整的本地网页、后端、论文处理和生成流程，也开源到了 GitHub：</w:t>
-      </w:r>
-    </w:p>
-    <w:p>
-      <w:r>
-        <w:t>https://github.com/qiudaoyu0201/med-research-mentor</w:t>
-      </w:r>
-    </w:p>
-    <w:p>
-      <w:r>
-        <w:t>先说最核心的想法：**用模块化 Skill 组织能力，用导师、新手模拟、来源核验三个 Agent 协作，让论文带读、PPT 汇报、研究方案在内部迭代中互相检验。** 我想优化的不只是某一次回答，而是“怎样把人教懂、教到能讲出来、能换个问题继续思考”。</w:t>
+        <w:t>面向医学科研初学者的智能体设计说明</w:t>
       </w:r>
     </w:p>
     <w:p>
       <w:pPr>
-        <w:spacing w:before="240"/>
+        <w:pStyle w:val="Heading1"/>
+        <w:keepNext/>
+        <w:keepLines/>
+        <w:snapToGrid w:val="0"/>
       </w:pPr>
       <w:r>
-        <w:rPr>
-          <w:rFonts w:ascii="黑体" w:hAnsi="黑体" w:eastAsia="黑体"/>
-          <w:b/>
-          <w:sz w:val="32"/>
-        </w:rPr>
-        <w:t>1. 出发点：科研小白需要的是有人带着建立思路</w:t>
-      </w:r>
-    </w:p>
-    <w:p>
-      <w:r>
-        <w:t>我自己刚进课题组，老师让读论文、学方法，但新手经常卡在“不知道怎么读”。英文术语不熟，图表不知道怎么分析，实验为什么这样做、对照为什么这样设，也很难一下看出来。和普通 AI 聊当然也可以，但每次都要重新告诉它怎么教，讲解深浅、连续性和原文对照也不稳定。</w:t>
-      </w:r>
-    </w:p>
-    <w:p>
-      <w:r>
-        <w:t>所以我希望它从背景、目的和价值开始，顺着论文读，遇到关键实验、图表和方法再展开。读完以后，不只是知道论文说了什么，还能解释“为什么做这个实验、结果支持什么、换成我的课题应该怎么设计”。</w:t>
-      </w:r>
-    </w:p>
-    <w:p>
-      <w:r>
-        <w:t>这种教学要有节奏：第一次遇到一类图，可以解释坐标和比较组；后面熟悉了，就更多关注结果和研究逻辑。专业词给中英文对照，回答有小标题和短段落，用户随时能追问、加深或继续。科研思维融入讲解，不把每一轮都弄成考试。</w:t>
+        <w:t>一、设计背景与目标</w:t>
       </w:r>
     </w:p>
     <w:p>
       <w:pPr>
-        <w:spacing w:before="240"/>
+        <w:ind w:firstLine="480"/>
+        <w:jc w:val="both"/>
+        <w:snapToGrid w:val="0"/>
       </w:pPr>
       <w:r>
-        <w:rPr>
-          <w:rFonts w:ascii="黑体" w:hAnsi="黑体" w:eastAsia="黑体"/>
-          <w:b/>
-          <w:sz w:val="32"/>
-        </w:rPr>
-        <w:t>2. 三条核心功能，各自解决一个实际需求</w:t>
-      </w:r>
-    </w:p>
-    <w:p>
-      <w:r>
-        <w:t>带读是主要入口，另外两项也能独立使用，不必先读完整篇论文。</w:t>
-      </w:r>
-    </w:p>
-    <w:p>
-      <w:r>
-        <w:t>带读中可以对照 PDF、原图和原文片段，也能引用回答里的一句话继续问。PPT 重视页面排版、图文关系和汇报主线，讲述提示单独导出，文字可以在 PowerPoint 里继续改。研究方案支持 DOCX 和 Markdown，既写打算做什么，也解释为什么这样设计。</w:t>
-      </w:r>
-    </w:p>
-    <w:p>
-      <w:r>
-        <w:t>日常使用还有几个我比较在意的细节：</w:t>
+        <w:t>医学科研初学者进入课题组后，常从阅读论文开始接触科研。理解论文既需要跨越英文术语障碍，也需要认识研究背景、理解方法原理、读懂图表，并判断实验结果如何支持结论。缺少科研训练的学生，即使知道论文做了什么，也往往难以解释为什么这样做，更难将其中的思路用于自己的研究问题。</w:t>
       </w:r>
     </w:p>
     <w:p>
       <w:pPr>
-        <w:pStyle w:val="ListBullet"/>
+        <w:ind w:firstLine="480"/>
+        <w:jc w:val="both"/>
+        <w:snapToGrid w:val="0"/>
       </w:pPr>
       <w:r>
-        <w:t>**节奏可以调整。** 可以先设新论文的默认讲解偏好，也可以在对话里临时要求展开或简略。追问可以偏离主线，再接回原来的阅读位置。</w:t>
+        <w:t>医研导师面向本科大一至大五及研究生一年级阶段的医学科研初学者，以论文为学习载体，提供连续、可追问、可对照原文的科研学习支持。系统从研究背景、问题和价值切入，顺着论文展开，在关键实验、方法与图表处深入解释，将专业术语、对照设置、证据推理与研究局限融入具体情境，并允许用户调整讲解深浅。</w:t>
       </w:r>
     </w:p>
     <w:p>
       <w:pPr>
-        <w:pStyle w:val="ListBullet"/>
+        <w:ind w:firstLine="480"/>
+        <w:jc w:val="both"/>
+        <w:snapToGrid w:val="0"/>
       </w:pPr>
       <w:r>
-        <w:t>**按需补资料。** 带读和方案流程可以利用后端文献检索辅助理解；检索来的题录、摘要与已读全文分别使用，不把搜到文献等同于读完文献。</w:t>
+        <w:t>作品围绕三个相互关联的目标展开：读懂研究，理解问题、方法与证据之间的关系；讲清研究，能够组织汇报并解释结论依据；尝试设计，能够结合新问题与实际条件，思考方法选择、对照设置和结果解释。</w:t>
       </w:r>
     </w:p>
     <w:p>
       <w:pPr>
-        <w:pStyle w:val="ListBullet"/>
+        <w:ind w:firstLine="480"/>
+        <w:jc w:val="both"/>
+        <w:snapToGrid w:val="0"/>
       </w:pPr>
       <w:r>
-        <w:t>**方案从实际条件出发。** 用户主要提供问题、思路、资源限制和自由建议，参考论文可选。医学范围覆盖基础、临床、影像、组学等，设计依据当前问题取舍。</w:t>
+        <w:t>为此，系统设置论文精读带学、科研汇报PPT生成和研究方案构思三条主线，以模块化Skill组织能力，通过多Agent协作开展教学、模拟学习和来源核验，并利用内部交叉验证持续改进教学与生成规则。</w:t>
       </w:r>
     </w:p>
     <w:p>
       <w:pPr>
-        <w:pStyle w:val="ListBullet"/>
+        <w:pStyle w:val="Heading1"/>
+        <w:keepNext/>
+        <w:keepLines/>
+        <w:snapToGrid w:val="0"/>
       </w:pPr>
       <w:r>
-        <w:t>**生成专区保持简单。** PPT 和方案重点做好生成与导出，拿出去继续编辑；不把产品做成复杂的在线办公软件，也不额外堆一个重型笔记系统。</w:t>
+        <w:t>二、核心功能与学习体验</w:t>
       </w:r>
     </w:p>
     <w:p>
       <w:pPr>
-        <w:spacing w:before="240"/>
+        <w:pStyle w:val="Heading2"/>
+        <w:keepNext/>
+        <w:keepLines/>
+        <w:snapToGrid w:val="0"/>
       </w:pPr>
       <w:r>
-        <w:rPr>
-          <w:rFonts w:ascii="黑体" w:hAnsi="黑体" w:eastAsia="黑体"/>
-          <w:b/>
-          <w:sz w:val="32"/>
-        </w:rPr>
-        <w:t>3. 为什么用三个 Agent：从三个角度检查同一件事</w:t>
-      </w:r>
-    </w:p>
-    <w:p>
-      <w:r>
-        <w:t>这里的 Agent 是不同职责的模型调用角色，不要求分别使用三家模型。调度器负责组织它们，Skill 提供各项任务的规则。</w:t>
-      </w:r>
-    </w:p>
-    <w:p>
-      <w:r>
-        <w:t>**导师 Agent**负责讲解和生成，也负责根据反馈修订。它要把背景、实验、结果和推理串起来，并根据用户的理解程度调整深浅。</w:t>
-      </w:r>
-    </w:p>
-    <w:p>
-      <w:r>
-        <w:t>**新手模拟 Agent**站在学习者的位置试读、复述、组织汇报或尝试设计。它暴露的是教学问题：这里为什么突然出现一个术语？这个对照到底有什么用？我能背出结论，但能解释依据吗？</w:t>
-      </w:r>
-    </w:p>
-    <w:p>
-      <w:r>
-        <w:t>**来源核验 Agent**回到原始材料检查事实与证据，也评价新手的回答和生成产物。它检查图件、引文、实验条件、比较关系，以及是否把相关性说成因果、把新方案假设当成已有结果。</w:t>
-      </w:r>
-    </w:p>
-    <w:p>
-      <w:r>
-        <w:t>基本配合是：</w:t>
-      </w:r>
-    </w:p>
-    <w:p>
-      <w:r>
-        <w:t>导师生成 → 新手试读/作答 → 来源核验</w:t>
-      </w:r>
-    </w:p>
-    <w:p>
-      <w:r>
-        <w:t>↑                         ↓</w:t>
-      </w:r>
-    </w:p>
-    <w:p>
-      <w:r>
-        <w:t>└── 针对断点修订或补教 ← 汇总问题</w:t>
-      </w:r>
-    </w:p>
-    <w:p>
-      <w:r>
-        <w:t>↓</w:t>
-      </w:r>
-    </w:p>
-    <w:p>
-      <w:r>
-        <w:t>复读与复核</w:t>
-      </w:r>
-    </w:p>
-    <w:p>
-      <w:r>
-        <w:t>这样可以把“讲得顺”“新手能理解”“证据站得住”放在一起考虑。普通局部追问按需调用，内部质量迭代则运行更完整的协作链路。</w:t>
+        <w:t>（一）论文精读带学</w:t>
       </w:r>
     </w:p>
     <w:p>
       <w:pPr>
-        <w:spacing w:before="240"/>
+        <w:ind w:firstLine="480"/>
+        <w:jc w:val="both"/>
+        <w:snapToGrid w:val="0"/>
       </w:pPr>
       <w:r>
-        <w:rPr>
-          <w:rFonts w:ascii="黑体" w:hAnsi="黑体" w:eastAsia="黑体"/>
-          <w:b/>
-          <w:sz w:val="32"/>
-        </w:rPr>
-        <w:t>4. 最想强调的亮点：三功能交叉迭代</w:t>
-      </w:r>
-    </w:p>
-    <w:p>
-      <w:r>
-        <w:t>**带读、PPT、研究方案既是用户功能，也是内部检验教学效果的不同任务。** 各自生成成功只是第一步，还要看它们能不能一起讲通同一项研究，以及能不能帮助新手完成下一步。</w:t>
-      </w:r>
-    </w:p>
-    <w:p>
-      <w:r>
-        <w:t>三个功能的关系可以这样理解：</w:t>
+        <w:t>用户导入医学论文PDF后，系统先介绍研究背景、核心问题与价值，再顺着论文展开讲解。在关键实验处，围绕“为什么做、如何做、设置了什么对照、结果说明什么”组织内容，将方法原理与研究目的联系起来，帮助初学者建立证据推理过程。</w:t>
       </w:r>
     </w:p>
     <w:p>
       <w:pPr>
-        <w:pStyle w:val="ListBullet"/>
+        <w:ind w:firstLine="480"/>
+        <w:jc w:val="both"/>
+        <w:snapToGrid w:val="0"/>
       </w:pPr>
       <w:r>
-        <w:t>**带读负责把研究讲明白。** 研究问题是什么，方法为什么适用，证据怎样形成结论。</w:t>
+        <w:t>讲解采用小标题与分段表达，提供专业术语的中英文对应，支持原文、PDF页面和图表对照。初次接触一类图表时，重点解释坐标、分组和比较关系；随着阅读推进，更多关注数据含义与结论依据。用户可以随时要求展开、简化或选中一句话追问，再接回阅读主线。界面呈现当前与下一步阅读范围，使学习保持方向感和连贯性。</w:t>
       </w:r>
     </w:p>
     <w:p>
       <w:pPr>
-        <w:pStyle w:val="ListBullet"/>
+        <w:ind w:firstLine="480"/>
+        <w:jc w:val="both"/>
+        <w:snapToGrid w:val="0"/>
       </w:pPr>
       <w:r>
-        <w:t>**PPT 负责把理解变成表达。** 压缩成几页后，能否保留关键比较和限制？新手能不能沿着页面讲清楚？</w:t>
+        <w:t>系统将科研思维融入具体讲解：解释结果时联系比较组和证据强度，讨论方法时说明适用条件，分析局限时指出其对结论的实际影响。用户可以沿着问题继续探索，也可以按正常节奏推进，使深入理解与阅读效率相互协调。</w:t>
       </w:r>
     </w:p>
     <w:p>
       <w:pPr>
-        <w:pStyle w:val="ListBullet"/>
+        <w:pStyle w:val="Heading2"/>
+        <w:keepNext/>
+        <w:keepLines/>
+        <w:snapToGrid w:val="0"/>
       </w:pPr>
       <w:r>
-        <w:t>**研究方案负责把理解变成设计。** 换个研究问题或资源条件，还能否提出合理对照、测量和分析思路？</w:t>
+        <w:t>（二）科研汇报PPT生成</w:t>
       </w:r>
     </w:p>
     <w:p>
       <w:pPr>
-        <w:spacing w:before="160"/>
+        <w:ind w:firstLine="480"/>
+        <w:jc w:val="both"/>
+        <w:snapToGrid w:val="0"/>
       </w:pPr>
       <w:r>
-        <w:rPr>
-          <w:rFonts w:ascii="黑体" w:hAnsi="黑体" w:eastAsia="黑体"/>
-          <w:b/>
-          <w:sz w:val="28"/>
-        </w:rPr>
-        <w:t>比如：让小白拿 PPT 组织一次汇报</w:t>
-      </w:r>
-    </w:p>
-    <w:p>
-      <w:r>
-        <w:t>这就是我很重视的一种验证思路：导师讲过论文，系统生成汇报材料，再让模拟新手组织讲述或回答相关任务，核验者检查他的表达。</w:t>
-      </w:r>
-    </w:p>
-    <w:p>
-      <w:r>
-        <w:t>如果小白只会念结论，解释不出图中的比较组，问题可能在前面的带读没讲透，也可能在 PPT 只放了结果、没有交代实验设计。如果小白把观察性结果说成因果，核验者就回查：是讲解本身误导了，还是 PPT 压缩时删掉了关键限制？随后对相应讲解或页面修订，再验证小白能否说清楚。</w:t>
-      </w:r>
-    </w:p>
-    <w:p>
-      <w:r>
-        <w:t>**这会同时检验两件事：PPT 能不能支持有效汇报，新手能不能把学到的内容表达出来。** 反馈还可以回流到带读方法和 Skill，而不只停留在给 PPT 打分。</w:t>
-      </w:r>
-    </w:p>
-    <w:p>
-      <w:r>
-        <w:t>代码里已经有围绕这类目标的教学产物曝光、证据复述、汇报提纲、设计草案和独立评价任务。其中汇报提纲任务还要求新手重新组织表达，不直接复制现成 PPT，从而观察是否真正抓住主线。这里的汇报验证以文字任务与产物评价进行。</w:t>
+        <w:t>用户选择论文、填写汇报重点和页数需求后，系统围绕研究背景、实验设计、主要证据、创新与不足组织幻灯片，结合论文原图安排图文内容，使汇报具有清晰的叙述顺序。</w:t>
       </w:r>
     </w:p>
     <w:p>
       <w:pPr>
-        <w:spacing w:before="160"/>
+        <w:ind w:firstLine="480"/>
+        <w:jc w:val="both"/>
+        <w:snapToGrid w:val="0"/>
       </w:pPr>
       <w:r>
-        <w:rPr>
-          <w:rFonts w:ascii="黑体" w:hAnsi="黑体" w:eastAsia="黑体"/>
-          <w:b/>
-          <w:sz w:val="28"/>
-        </w:rPr>
-        <w:t>再把研究方案拉进来</w:t>
-      </w:r>
-    </w:p>
-    <w:p>
-      <w:r>
-        <w:t>新手理解一篇论文后，进一步尝试设计新研究。原研究是住院患者随访，新任务只有一次体检记录，就要重新考虑可回答的问题、时间顺序和结局，而不能照抄原论文。</w:t>
-      </w:r>
-    </w:p>
-    <w:p>
-      <w:r>
-        <w:t>方案中的困难会反过来暴露教学缺口：为什么必须有随访？为什么需要这个对照？原方法需要什么资源？这些问题可以成为下一轮补教和规则改进的依据。</w:t>
+        <w:t>页面内容与讲述提示分别组织：幻灯片呈现关键观点和证据，讲述提示帮助用户解释实验思路与结果。生成成果支持预览和可编辑PPTX导出，方便用户准备组会、修改页面及与导师交流。</w:t>
       </w:r>
     </w:p>
     <w:p>
       <w:pPr>
-        <w:spacing w:before="160"/>
+        <w:pStyle w:val="Heading2"/>
+        <w:keepNext/>
+        <w:keepLines/>
+        <w:snapToGrid w:val="0"/>
       </w:pPr>
       <w:r>
-        <w:rPr>
-          <w:rFonts w:ascii="黑体" w:hAnsi="黑体" w:eastAsia="黑体"/>
-          <w:b/>
-          <w:sz w:val="28"/>
-        </w:rPr>
-        <w:t>三类产物一起核对</w:t>
-      </w:r>
-    </w:p>
-    <w:p>
-      <w:r>
-        <w:t>已有跨功能复核流程将带读、PPT、方案及其原始来源放在一起，检查关键事实、条件、图件和结论是否一致：</w:t>
-      </w:r>
-    </w:p>
-    <w:p>
-      <w:r>
-        <w:t>同一组论文来源</w:t>
-      </w:r>
-    </w:p>
-    <w:p>
-      <w:r>
-        <w:t>├─ 带读：讲清研究</w:t>
-      </w:r>
-    </w:p>
-    <w:p>
-      <w:r>
-        <w:t>├─ PPT：组织汇报</w:t>
-      </w:r>
-    </w:p>
-    <w:p>
-      <w:r>
-        <w:t>└─ 方案：尝试设计</w:t>
-      </w:r>
-    </w:p>
-    <w:p>
-      <w:r>
-        <w:t>↓</w:t>
-      </w:r>
-    </w:p>
-    <w:p>
-      <w:r>
-        <w:t>跨产物证据与条件核验</w:t>
-      </w:r>
-    </w:p>
-    <w:p>
-      <w:r>
-        <w:t>↓</w:t>
-      </w:r>
-    </w:p>
-    <w:p>
-      <w:r>
-        <w:t>新手复述 / 汇报 / 设计</w:t>
-      </w:r>
-    </w:p>
-    <w:p>
-      <w:r>
-        <w:t>↓</w:t>
-      </w:r>
-    </w:p>
-    <w:p>
-      <w:r>
-        <w:t>定位问题 → 补教或修订 → 复验</w:t>
-      </w:r>
-    </w:p>
-    <w:p>
-      <w:r>
-        <w:t>↓</w:t>
-      </w:r>
-    </w:p>
-    <w:p>
-      <w:r>
-        <w:t>改变条件的新任务 → 检查迁移</w:t>
-      </w:r>
-    </w:p>
-    <w:p>
-      <w:r>
-        <w:t>↓</w:t>
-      </w:r>
-    </w:p>
-    <w:p>
-      <w:r>
-        <w:t>用于下一轮 Skill 候选比较</w:t>
-      </w:r>
-    </w:p>
-    <w:p>
-      <w:r>
-        <w:t>三份产物一致还不够，最终仍要回到论文来源。内部流程保存实际产物和来源版本，修改内容后重新复核。用户使用时可以只做一项任务，完整交叉链路主要用于内部质量迭代。</w:t>
+        <w:t>（三）研究方案构思</w:t>
       </w:r>
     </w:p>
     <w:p>
       <w:pPr>
-        <w:spacing w:before="240"/>
+        <w:ind w:firstLine="480"/>
+        <w:jc w:val="both"/>
+        <w:snapToGrid w:val="0"/>
       </w:pPr>
       <w:r>
-        <w:rPr>
-          <w:rFonts w:ascii="黑体" w:hAnsi="黑体" w:eastAsia="黑体"/>
-          <w:b/>
-          <w:sz w:val="32"/>
-        </w:rPr>
-        <w:t>5. 为什么把能力拆成 Skill</w:t>
-      </w:r>
-    </w:p>
-    <w:p>
-      <w:r>
-        <w:t>教学规则全部堆在一个长提示词里，会很难定位问题：是读图没讲好、方案设计不合理，还是新手模拟得太像专家？拆成模块后，可以围绕问题修改对应能力，再检验是否改善了整体效果。</w:t>
-      </w:r>
-    </w:p>
-    <w:p>
-      <w:r>
-        <w:t>当前有 **11 个 Skill + 一份共享规则**：</w:t>
-      </w:r>
-    </w:p>
-    <w:p>
-      <w:r>
-        <w:t>Skill 和 Agent 不一一对应。例如导师讲图时可以组合图表教学与证据链，制作汇报时再使用 PPT 模块；新手模拟和核验模块则从各自角度提供反馈。</w:t>
-      </w:r>
-    </w:p>
-    <w:p>
-      <w:r>
-        <w:t>模块化还有两个直接好处：一是便于替换模型和增加医学方向，二是能比较同一批材料上旧规则与新规则的效果。研究方案的生成规则也已经从后端拆成独立 Skill，接入了实际生成和候选快照。</w:t>
+        <w:t>用户提供研究方向、初步问题、已有资源与现实限制，并按需导入参考论文。系统据此组织研究目标、研究对象、方法选择、对照设置、测量指标和分析思路，形成可与导师讨论的方案草案。</w:t>
       </w:r>
     </w:p>
     <w:p>
       <w:pPr>
-        <w:spacing w:before="240"/>
+        <w:ind w:firstLine="480"/>
+        <w:jc w:val="both"/>
+        <w:snapToGrid w:val="0"/>
       </w:pPr>
       <w:r>
-        <w:rPr>
-          <w:rFonts w:ascii="黑体" w:hAnsi="黑体" w:eastAsia="黑体"/>
-          <w:b/>
-          <w:sz w:val="32"/>
-        </w:rPr>
-        <w:t>6. 内部迭代具体怎么运行</w:t>
-      </w:r>
-    </w:p>
-    <w:p>
-      <w:r>
-        <w:t>这里说的“训练导师”，主要是优化 Skill、提示词、角色协作和调度，不是训练底层模型参数。</w:t>
-      </w:r>
-    </w:p>
-    <w:p>
-      <w:r>
-        <w:t>一次迭代围绕一个明确问题展开，例如：小白能否说清对照的作用，PPT 是否丢失重要条件，方案是否保留新任务的资源限制。</w:t>
-      </w:r>
-    </w:p>
-    <w:p>
-      <w:r>
-        <w:t>1. **固定材料和规则版本。** 准备论文或局部样本，保留基线和候选，记录模型配置及预算。</w:t>
-      </w:r>
-    </w:p>
-    <w:p>
-      <w:r>
-        <w:t>2. **运行教学和产物生成。** 根据本轮目标运行带读、PPT、方案及必要角色。</w:t>
-      </w:r>
-    </w:p>
-    <w:p>
-      <w:r>
-        <w:t>3. **检查产物，再观察学习表现。** 对照来源核验，也让模拟新手复述、汇报或设计。</w:t>
-      </w:r>
-    </w:p>
-    <w:p>
-      <w:r>
-        <w:t>4. **补教和复验。** 针对具体断点修订，看问题是否得到改善。</w:t>
-      </w:r>
-    </w:p>
-    <w:p>
-      <w:r>
-        <w:t>5. **换条件检查迁移。** 改变人群、设备、时间、可用数据等，看是否仍机械套用原论文。</w:t>
-      </w:r>
-    </w:p>
-    <w:p>
-      <w:r>
-        <w:t>6. **比较后采用规则。** 通过候选比较和规则发布流程，让改进进入实际使用。</w:t>
-      </w:r>
-    </w:p>
-    <w:p>
-      <w:r>
-        <w:t>学习评估还设计了“未学习”“只看材料”“材料加教学”三种分支。这样能比较教学额外带来的帮助，而不只看模型本来会多少。新手收到的是允许看到的材料和教学产物，评价记录与答案提示分开。</w:t>
-      </w:r>
-    </w:p>
-    <w:p>
-      <w:r>
-        <w:t>我的取舍是：**小样本快速定位问题，完整论文检查连贯性，三功能交叉检查应用效果。** 内部评价严格一些，用户交付抓住事实、证据和关键设计问题，不因零碎措辞反复阻断。优先把常见使用场景做好，再处理少见边界情况。</w:t>
+        <w:t>方案强调设计理由与实际条件的联系。例如，当用户只有既往病历、无法新增随访时，研究问题、结局指标和分析方式需要随可用数据调整。系统通过呈现这些选择依据，帮助初学者理解如何从想法逐步形成研究设计。成果支持Word与Markdown导出。</w:t>
       </w:r>
     </w:p>
     <w:p>
       <w:pPr>
-        <w:spacing w:before="240"/>
+        <w:ind w:firstLine="480"/>
+        <w:jc w:val="both"/>
+        <w:snapToGrid w:val="0"/>
       </w:pPr>
       <w:r>
-        <w:rPr>
-          <w:rFonts w:ascii="黑体" w:hAnsi="黑体" w:eastAsia="黑体"/>
-          <w:b/>
-          <w:sz w:val="32"/>
-        </w:rPr>
-        <w:t>7. 前后端各自做什么</w:t>
-      </w:r>
-    </w:p>
-    <w:p>
-      <w:r>
-        <w:t>前端使用 **React + Vite**，负责工作区、对话、论文导航、PDF/原图对照、选句追问、设置，以及 PPT 和研究方案专区。它把学习过程做成一个能持续使用的界面。</w:t>
-      </w:r>
-    </w:p>
-    <w:p>
-      <w:r>
-        <w:t>后端使用 **Express + TypeScript**，负责论文导入与解析、图件和来源管理、模型调用、Agent 调度、Skill 加载、本地保存、阅读进度、生成版本，以及 PPTX、DOCX、Markdown 导出。</w:t>
-      </w:r>
-    </w:p>
-    <w:p>
-      <w:r>
-        <w:t>调度器处理任务顺序、按需调用、预算、取消和恢复。证据与版本记录让生成、核验和后续修改能够对得上，也为内部迭代提供可比较的输入。</w:t>
-      </w:r>
-    </w:p>
-    <w:p>
-      <w:r>
-        <w:t>整体关系是：**前端承载使用体验，后端组织数据和执行，Skill 定义能力，三个 Agent 分工完成教学与反馈。**</w:t>
+        <w:t>三项功能可独立使用，也可围绕同一研究主题展开。系统按需利用文献检索补充资料，并区分题录、摘要与全文证据，为阅读和构思提供支持。</w:t>
       </w:r>
     </w:p>
     <w:p>
       <w:pPr>
-        <w:spacing w:before="240"/>
+        <w:pStyle w:val="Heading1"/>
+        <w:keepNext/>
+        <w:keepLines/>
+        <w:snapToGrid w:val="0"/>
       </w:pPr>
       <w:r>
-        <w:rPr>
-          <w:rFonts w:ascii="黑体" w:hAnsi="黑体" w:eastAsia="黑体"/>
-          <w:b/>
-          <w:sz w:val="32"/>
-        </w:rPr>
-        <w:t>8. 目前已经做过哪些优化和测试</w:t>
-      </w:r>
-    </w:p>
-    <w:p>
-      <w:r>
-        <w:t>最近的工作集中在把这个设计落实到可用流程，主要包括：</w:t>
+        <w:t>三、多Agent协作与三功能交叉验证</w:t>
       </w:r>
     </w:p>
     <w:p>
       <w:pPr>
-        <w:pStyle w:val="ListBullet"/>
+        <w:pStyle w:val="Heading2"/>
+        <w:keepNext/>
+        <w:keepLines/>
+        <w:snapToGrid w:val="0"/>
       </w:pPr>
       <w:r>
-        <w:t>**带读体验：** 连续阅读、当前与下一步、讲解深度、术语解释、选句追问及原文对照。</w:t>
+        <w:t>（一）以导师为主导的角色分工</w:t>
       </w:r>
     </w:p>
     <w:p>
       <w:pPr>
-        <w:pStyle w:val="ListBullet"/>
+        <w:ind w:firstLine="480"/>
+        <w:jc w:val="both"/>
+        <w:snapToGrid w:val="0"/>
       </w:pPr>
       <w:r>
-        <w:t>**图表证据：** 原图显示、来源绑定、图表比较关系，以及跨功能使用图件时的一致性。</w:t>
+        <w:t>医研导师以导师Agent为主Agent，主导教学与内容生成，由调度器组织新手模拟和来源核验两个Agent协作。</w:t>
       </w:r>
     </w:p>
     <w:p>
       <w:pPr>
-        <w:pStyle w:val="ListBullet"/>
+        <w:keepLines/>
+        <w:ind w:left="480" w:hanging="480"/>
+        <w:jc w:val="both"/>
+        <w:snapToGrid w:val="0"/>
       </w:pPr>
       <w:r>
-        <w:t>**PPT 和方案：** 幻灯片布局、独立讲述提示、可编辑导出，方案的条件保留、来源核对和文件生成。</w:t>
+        <w:rPr>
+          <w:b/>
+        </w:rPr>
+        <w:t>1．导师Agent：</w:t>
+      </w:r>
+      <w:r>
+        <w:t>组织讲解与成果生成，解释研究逻辑，根据反馈修订内容、开展针对性补教。</w:t>
       </w:r>
     </w:p>
     <w:p>
       <w:pPr>
-        <w:pStyle w:val="ListBullet"/>
+        <w:keepLines/>
+        <w:ind w:left="480" w:hanging="480"/>
+        <w:jc w:val="both"/>
+        <w:snapToGrid w:val="0"/>
       </w:pPr>
       <w:r>
-        <w:t>**内部协作：** 新手与核验角色的可见信息、跨产物复核、补教与迁移、候选规则隔离。</w:t>
+        <w:rPr>
+          <w:b/>
+        </w:rPr>
+        <w:t>2．新手模拟Agent：</w:t>
+      </w:r>
+      <w:r>
+        <w:t>从初学者视角试读，完成复述、汇报和设计任务，暴露理解断点与应用困难。</w:t>
       </w:r>
     </w:p>
     <w:p>
       <w:pPr>
-        <w:pStyle w:val="ListBullet"/>
+        <w:keepLines/>
+        <w:ind w:left="480" w:hanging="480"/>
+        <w:jc w:val="both"/>
+        <w:snapToGrid w:val="0"/>
       </w:pPr>
       <w:r>
-        <w:t>**运行稳定性：** 数据保存、取消、并发、缓存、连接失败与有限恢复。</w:t>
+        <w:rPr>
+          <w:b/>
+        </w:rPr>
+        <w:t>3．来源核验Agent：</w:t>
       </w:r>
-    </w:p>
-    <w:p>
       <w:r>
-        <w:t>测试分三层：</w:t>
-      </w:r>
-    </w:p>
-    <w:p>
-      <w:r>
-        <w:t>322 是当前工程测试项数，不是模型迭代轮数。模型实测做过多批次，旧记录按实验分开保存，介绍里不把它们拼成一个没有统一口径的总次数。更值得传达的是，已经把“输出内容、检查证据、观察学习表现、修改规则、再次验证”串起来了。</w:t>
+        <w:t>对照原文、图表及任务条件，检查事实、引用与结论依据，评价产物和新手作答。</w:t>
       </w:r>
     </w:p>
     <w:p>
       <w:pPr>
-        <w:spacing w:before="240"/>
+        <w:ind w:firstLine="480"/>
+        <w:jc w:val="both"/>
+        <w:snapToGrid w:val="0"/>
+      </w:pPr>
+      <w:r>
+        <w:t>调度器根据任务组合角色与Skill，汇总问题并组织修订、复读和复核，同时管理执行顺序、预算与运行记录。日常使用按需调用，内部迭代围绕具体问题运行完整验证流程。</w:t>
+      </w:r>
+    </w:p>
+    <w:p>
+      <w:pPr>
+        <w:ind w:firstLine="480"/>
+        <w:jc w:val="both"/>
+        <w:snapToGrid w:val="0"/>
+      </w:pPr>
+      <w:r>
+        <w:t>新手模拟围绕设定的学习基础和已接触材料展开，重点观察概念是否理解、推理能否衔接、结论能否解释。核验角色则依据原始材料检查作答，定位到具体语句、图件或实验条件。两类反馈汇总后，导师可以针对理解问题补充解释，针对证据问题修正表述，使修订具有明确目标。</w:t>
+      </w:r>
+    </w:p>
+    <w:p>
+      <w:pPr>
+        <w:pStyle w:val="Heading2"/>
+        <w:keepNext/>
+        <w:keepLines/>
+        <w:snapToGrid w:val="0"/>
+      </w:pPr>
+      <w:r>
+        <w:t>（二）用汇报任务同时检验材料与学习表现</w:t>
+      </w:r>
+    </w:p>
+    <w:p>
+      <w:pPr>
+        <w:ind w:firstLine="480"/>
+        <w:jc w:val="both"/>
+        <w:snapToGrid w:val="0"/>
+      </w:pPr>
+      <w:r>
+        <w:t>论文带读、PPT和研究方案分别承载理解、表达与设计任务。内部迭代将三类产物与原始来源关联起来，检查证据一致性，并观察模拟新手能否使用材料完成任务。</w:t>
+      </w:r>
+    </w:p>
+    <w:p>
+      <w:pPr>
+        <w:ind w:firstLine="480"/>
+        <w:jc w:val="both"/>
+        <w:snapToGrid w:val="0"/>
+      </w:pPr>
+      <w:r>
+        <w:t>例如，导师讲解某项实验后，系统生成对应汇报材料，再让模拟新手组织文字汇报提纲或讲述内容，解释实验目的、对照设置和结果依据。如果新手只能复述结论，却说不清比较组的作用，系统便回查带读是否遗漏了设计理由、PPT是否在压缩内容时删去了关键条件。导师据此补教或修订，再由新手重新作答、核验角色检查改善情况。</w:t>
+      </w:r>
+    </w:p>
+    <w:p>
+      <w:pPr>
+        <w:ind w:firstLine="480"/>
+        <w:jc w:val="both"/>
+        <w:snapToGrid w:val="0"/>
+      </w:pPr>
+      <w:r>
+        <w:t>这一过程同时检验汇报材料的表达效果与模拟新手的学习表现。汇报提纲等任务要求重新组织内容，以观察对研究主线和证据关系的掌握。PPT中暴露的问题可以反馈到带读，教学中的理解断点也能指导汇报材料改进。</w:t>
+      </w:r>
+    </w:p>
+    <w:p>
+      <w:pPr>
+        <w:ind w:firstLine="480"/>
+        <w:jc w:val="both"/>
+        <w:snapToGrid w:val="0"/>
+      </w:pPr>
+      <w:r>
+        <w:t>交叉检查还关注成果转换中的信息损失。例如，带读已经解释了研究对象的适用范围，汇报页面在提炼结论时也需要保留这一条件；研究方案借鉴相关方法时，则需重新判断其是否适合新的对象和资源。三个功能由此共享证据要求，同时分别承担理解、表达和应用的检验任务。</w:t>
+      </w:r>
+    </w:p>
+    <w:p>
+      <w:pPr>
+        <w:pStyle w:val="Heading2"/>
+        <w:keepNext/>
+        <w:keepLines/>
+        <w:snapToGrid w:val="0"/>
+      </w:pPr>
+      <w:r>
+        <w:t>（三）用研究设计任务检查知识迁移</w:t>
+      </w:r>
+    </w:p>
+    <w:p>
+      <w:pPr>
+        <w:ind w:firstLine="480"/>
+        <w:jc w:val="both"/>
+        <w:snapToGrid w:val="0"/>
+      </w:pPr>
+      <w:r>
+        <w:t>内部流程进一步改变研究人群、可用资源、观察时间或结局条件，让模拟新手尝试形成新的研究设计。</w:t>
+      </w:r>
+    </w:p>
+    <w:p>
+      <w:pPr>
+        <w:ind w:firstLine="480"/>
+        <w:jc w:val="both"/>
+        <w:snapToGrid w:val="0"/>
+      </w:pPr>
+      <w:r>
+        <w:t>例如，原论文使用长期随访数据，新任务只有一次体检记录，新手就需要重新考虑可回答的问题、变量的时间关系与结论范围。核验角色结合新条件评价设计；发现机械照搬原研究的情况后，导师围绕相应方法和证据问题补教，再开展复验。</w:t>
+      </w:r>
+    </w:p>
+    <w:p>
+      <w:pPr>
+        <w:ind w:firstLine="480"/>
+        <w:jc w:val="both"/>
+        <w:snapToGrid w:val="0"/>
+      </w:pPr>
+      <w:r>
+        <w:t>方案中的困难也会反馈到带读与汇报：方法条件是否讲清、关键限制是否保留、概念能否用于新情境，都成为后续优化的依据。</w:t>
+      </w:r>
+    </w:p>
+    <w:p>
+      <w:pPr>
+        <w:pStyle w:val="Heading2"/>
+        <w:keepNext/>
+        <w:keepLines/>
+        <w:snapToGrid w:val="0"/>
+      </w:pPr>
+      <w:r>
+        <w:t>（四）将交叉反馈落实到内部迭代</w:t>
+      </w:r>
+    </w:p>
+    <w:p>
+      <w:pPr>
+        <w:ind w:firstLine="480"/>
+        <w:jc w:val="both"/>
+        <w:snapToGrid w:val="0"/>
+      </w:pPr>
+      <w:r>
+        <w:t>内部闭环按照“生成产物—交叉核验—新手作答—补教修订—复验与迁移”展开。跨产物核验关联原始来源，检查事实、实验条件、图件和结论的表达，并区分已有研究结果与新方案假设。</w:t>
+      </w:r>
+    </w:p>
+    <w:p>
+      <w:pPr>
+        <w:ind w:firstLine="480"/>
+        <w:jc w:val="both"/>
+        <w:snapToGrid w:val="0"/>
+      </w:pPr>
+      <w:r>
+        <w:t>迭代结合小样本与完整论文：小样本快速定位术语、读图和对照理解等问题；完整论文检查讲解连贯性与汇报逻辑；跨功能任务检查表达和设计中的应用表现。内部迭代主要优化Skill、提示规则与协作流程，改进候选经比较验证后用于后续服务。完整交叉流程主要用于内部质量迭代，用户可按当前需求使用单项功能。</w:t>
+      </w:r>
+    </w:p>
+    <w:p>
+      <w:pPr>
+        <w:ind w:firstLine="480"/>
+        <w:jc w:val="both"/>
+        <w:snapToGrid w:val="0"/>
+      </w:pPr>
+      <w:r>
+        <w:t>每轮比较保留材料、规则版本、模型配置与运行记录，将当前规则作为基线，将修改后的规则作为候选。候选规则在独立快照中验证，评价内容与作答所需材料分开组织，减少答案提示对模拟表现的影响。通过比较与发布检查后，采用的规则才进入实际服务，使局部调整有据可查，也便于发现改善是否伴随其他能力退步。</w:t>
+      </w:r>
+    </w:p>
+    <w:p>
+      <w:pPr>
+        <w:pStyle w:val="Heading1"/>
+        <w:keepNext/>
+        <w:keepLines/>
+        <w:snapToGrid w:val="0"/>
+      </w:pPr>
+      <w:r>
+        <w:t>四、Skill模块化设计</w:t>
+      </w:r>
+    </w:p>
+    <w:p>
+      <w:pPr>
+        <w:pStyle w:val="Heading2"/>
+        <w:keepNext/>
+        <w:keepLines/>
+        <w:snapToGrid w:val="0"/>
+      </w:pPr>
+      <w:r>
+        <w:t>（一）按能力拆分，按任务组合</w:t>
+      </w:r>
+    </w:p>
+    <w:p>
+      <w:pPr>
+        <w:ind w:firstLine="480"/>
+        <w:jc w:val="both"/>
+        <w:snapToGrid w:val="0"/>
+      </w:pPr>
+      <w:r>
+        <w:t>系统将教学与生成能力拆分为11个Skill，明确职责、输入、输出与质量要求，并通过共享规则统一教学和证据标准。</w:t>
+      </w:r>
+    </w:p>
+    <w:p>
+      <w:pPr>
+        <w:keepLines/>
+        <w:ind w:left="480" w:hanging="480"/>
+        <w:jc w:val="both"/>
+        <w:snapToGrid w:val="0"/>
       </w:pPr>
       <w:r>
         <w:rPr>
-          <w:rFonts w:ascii="黑体" w:hAnsi="黑体" w:eastAsia="黑体"/>
           <w:b/>
-          <w:sz w:val="32"/>
         </w:rPr>
-        <w:t>9. 怎么用，以及现在是什么状态</w:t>
+        <w:t>1．科研学习主助手：</w:t>
+      </w:r>
+      <w:r>
+        <w:t>理解用户目标，组织任务与后续追问。</w:t>
       </w:r>
     </w:p>
     <w:p>
+      <w:pPr>
+        <w:keepLines/>
+        <w:ind w:left="480" w:hanging="480"/>
+        <w:jc w:val="both"/>
+        <w:snapToGrid w:val="0"/>
+      </w:pPr>
       <w:r>
-        <w:t>项目已经开源，按 README 安装 Node.js 22.13+ 和项目依赖，配置自己的模型后启动本地网页。可以使用已配置的 Codex CLI，也可以使用独立兼容 API；兼容 API 路径不要求原生 Codex 订阅额度。</w:t>
+        <w:rPr>
+          <w:b/>
+        </w:rPr>
+        <w:t>2．论文带读：</w:t>
+      </w:r>
+      <w:r>
+        <w:t>串联背景、问题、方法、结果和讨论。</w:t>
       </w:r>
     </w:p>
     <w:p>
+      <w:pPr>
+        <w:keepLines/>
+        <w:ind w:left="480" w:hanging="480"/>
+        <w:jc w:val="both"/>
+        <w:snapToGrid w:val="0"/>
+      </w:pPr>
       <w:r>
-        <w:t>进去后导入论文就能开始带读，也可以直接去 PPT 或研究方案专区。阅读和生成记录保存在本机，调用模型时发送当前任务所需材料。源码和 Skill 都能继续修改，项目使用 MIT 许可证。</w:t>
+        <w:rPr>
+          <w:b/>
+        </w:rPr>
+        <w:t>3．证据链：</w:t>
+      </w:r>
+      <w:r>
+        <w:t>连接研究问题、实验、结果与结论。</w:t>
       </w:r>
     </w:p>
     <w:p>
+      <w:pPr>
+        <w:keepLines/>
+        <w:ind w:left="480" w:hanging="480"/>
+        <w:jc w:val="both"/>
+        <w:snapToGrid w:val="0"/>
+      </w:pPr>
       <w:r>
-        <w:t>我现在最想让你理解的，是这套设计的连接方式：**读懂论文 → 用 PPT 讲清楚 → 用方案尝试设计 → 三角色检查哪里没讲明白、哪里证据不够、哪里迁移错了 → 反馈到下一轮教学和 Skill。** 这是三条功能放在同一个智能体里的意义，也是后面继续迭代的主线。</w:t>
+        <w:rPr>
+          <w:b/>
+        </w:rPr>
+        <w:t>4．方法教学：</w:t>
+      </w:r>
+      <w:r>
+        <w:t>解释方法原理、实验目的与对照设计。</w:t>
+      </w:r>
+    </w:p>
+    <w:p>
+      <w:pPr>
+        <w:keepLines/>
+        <w:ind w:left="480" w:hanging="480"/>
+        <w:jc w:val="both"/>
+        <w:snapToGrid w:val="0"/>
+      </w:pPr>
+      <w:r>
+        <w:rPr>
+          <w:b/>
+        </w:rPr>
+        <w:t>5．图表教学：</w:t>
+      </w:r>
+      <w:r>
+        <w:t>解释坐标、分组、统计及数据含义。</w:t>
+      </w:r>
+    </w:p>
+    <w:p>
+      <w:pPr>
+        <w:keepLines/>
+        <w:ind w:left="480" w:hanging="480"/>
+        <w:jc w:val="both"/>
+        <w:snapToGrid w:val="0"/>
+      </w:pPr>
+      <w:r>
+        <w:rPr>
+          <w:b/>
+        </w:rPr>
+        <w:t>6．术语解释：</w:t>
+      </w:r>
+      <w:r>
+        <w:t>提供中英文对应与语境化解释。</w:t>
+      </w:r>
+    </w:p>
+    <w:p>
+      <w:pPr>
+        <w:keepLines/>
+        <w:ind w:left="480" w:hanging="480"/>
+        <w:jc w:val="both"/>
+        <w:snapToGrid w:val="0"/>
+      </w:pPr>
+      <w:r>
+        <w:rPr>
+          <w:b/>
+        </w:rPr>
+        <w:t>7．论文汇报PPT：</w:t>
+      </w:r>
+      <w:r>
+        <w:t>组织汇报主线、图文内容与讲述提示。</w:t>
+      </w:r>
+    </w:p>
+    <w:p>
+      <w:pPr>
+        <w:keepLines/>
+        <w:ind w:left="480" w:hanging="480"/>
+        <w:jc w:val="both"/>
+        <w:snapToGrid w:val="0"/>
+      </w:pPr>
+      <w:r>
+        <w:rPr>
+          <w:b/>
+        </w:rPr>
+        <w:t>8．医学研究方案：</w:t>
+      </w:r>
+      <w:r>
+        <w:t>根据问题、参考材料与限制组织方案。</w:t>
+      </w:r>
+    </w:p>
+    <w:p>
+      <w:pPr>
+        <w:keepLines/>
+        <w:ind w:left="480" w:hanging="480"/>
+        <w:jc w:val="both"/>
+        <w:snapToGrid w:val="0"/>
+      </w:pPr>
+      <w:r>
+        <w:rPr>
+          <w:b/>
+        </w:rPr>
+        <w:t>9．来源核验：</w:t>
+      </w:r>
+      <w:r>
+        <w:t>检查事实、引用与证据支持。</w:t>
+      </w:r>
+    </w:p>
+    <w:p>
+      <w:pPr>
+        <w:keepLines/>
+        <w:ind w:left="480" w:hanging="480"/>
+        <w:jc w:val="both"/>
+        <w:snapToGrid w:val="0"/>
+      </w:pPr>
+      <w:r>
+        <w:rPr>
+          <w:b/>
+        </w:rPr>
+        <w:t>10．新手试读模拟：</w:t>
+      </w:r>
+      <w:r>
+        <w:t>识别术语障碍、推理跳步和理解断点。</w:t>
+      </w:r>
+    </w:p>
+    <w:p>
+      <w:pPr>
+        <w:keepLines/>
+        <w:ind w:left="480" w:hanging="480"/>
+        <w:jc w:val="both"/>
+        <w:snapToGrid w:val="0"/>
+      </w:pPr>
+      <w:r>
+        <w:rPr>
+          <w:b/>
+        </w:rPr>
+        <w:t>11．学习者任务模拟：</w:t>
+      </w:r>
+      <w:r>
+        <w:t>支持模拟作答，为学习与迁移评价提供输入。</w:t>
+      </w:r>
+    </w:p>
+    <w:p>
+      <w:pPr>
+        <w:ind w:firstLine="480"/>
+        <w:jc w:val="both"/>
+        <w:snapToGrid w:val="0"/>
+      </w:pPr>
+      <w:r>
+        <w:t>Skill与Agent采用灵活的组合关系。例如，导师解释实验图时，可组合图表教学、方法教学和证据链；制作汇报时，再调用PPT模块。共同的核验规则使不同成果在事实与推理要求上保持一致。</w:t>
+      </w:r>
+    </w:p>
+    <w:p>
+      <w:pPr>
+        <w:pStyle w:val="Heading2"/>
+        <w:keepNext/>
+        <w:keepLines/>
+        <w:snapToGrid w:val="0"/>
+      </w:pPr>
+      <w:r>
+        <w:t>（二）定向改进，降低开发维护成本</w:t>
+      </w:r>
+    </w:p>
+    <w:p>
+      <w:pPr>
+        <w:ind w:firstLine="480"/>
+        <w:jc w:val="both"/>
+        <w:snapToGrid w:val="0"/>
+      </w:pPr>
+      <w:r>
+        <w:t>模块化使反馈能够定位到具体能力：对照理解困难可以调整方法教学，PPT遗漏条件可以优化汇报与证据链，方案忽略资源限制可以改进条件分析规则。候选版本在相同材料与任务上进行比较，再通过完整论文和跨功能任务检查整体表现。</w:t>
+      </w:r>
+    </w:p>
+    <w:p>
+      <w:pPr>
+        <w:ind w:firstLine="480"/>
+        <w:jc w:val="both"/>
+        <w:snapToGrid w:val="0"/>
+      </w:pPr>
+      <w:r>
+        <w:t>共享模块减少重复编写规则的工作，局部修改缩短问题定位、调整与验证的路径。扩展医学方向或适配其他模型时，可以复用现有框架，集中调整相关模块与接入配置，使有限的开发时间和迭代资源用于改善具体能力。</w:t>
+      </w:r>
+    </w:p>
+    <w:p>
+      <w:pPr>
+        <w:ind w:firstLine="480"/>
+        <w:jc w:val="both"/>
+        <w:snapToGrid w:val="0"/>
+      </w:pPr>
+      <w:r>
+        <w:t>共享规则负责不同任务都需要遵循的教学和证据原则，各Skill补充具体任务的方法与输出要求。这种分层使共同要求能够统一维护，任务差异能够分别优化，也便于检查一次规则变更会影响哪些功能。</w:t>
+      </w:r>
+    </w:p>
+    <w:p>
+      <w:pPr>
+        <w:pStyle w:val="Heading1"/>
+        <w:keepNext/>
+        <w:keepLines/>
+        <w:snapToGrid w:val="0"/>
+      </w:pPr>
+      <w:r>
+        <w:t>五、技术架构与运行流程</w:t>
+      </w:r>
+    </w:p>
+    <w:p>
+      <w:pPr>
+        <w:ind w:firstLine="480"/>
+        <w:jc w:val="both"/>
+        <w:snapToGrid w:val="0"/>
+      </w:pPr>
+      <w:r>
+        <w:t>系统采用前后端分离架构，通过本地网页提供使用入口。React与Vite前端承载阅读、追问、原文图表对照和成果预览；Express与TypeScript后端负责论文解析、模型调用、Agent调度、Skill加载、数据保存及文件导出。</w:t>
+      </w:r>
+    </w:p>
+    <w:p>
+      <w:pPr>
+        <w:ind w:firstLine="480"/>
+        <w:jc w:val="both"/>
+        <w:snapToGrid w:val="0"/>
+      </w:pPr>
+      <w:r>
+        <w:t>整体分为四层：用户交互层提供阅读与生成工作区；任务调度层组织角色、规则和执行流程；模型与能力层完成讲解、生成、模拟与核验；资料与成果层管理论文来源、对话记录和生成版本。</w:t>
+      </w:r>
+    </w:p>
+    <w:p>
+      <w:pPr>
+        <w:ind w:firstLine="480"/>
+        <w:jc w:val="both"/>
+        <w:snapToGrid w:val="0"/>
+      </w:pPr>
+      <w:r>
+        <w:t>基本运行流程为：导入论文与提出需求→组织相关材料→调度角色与Skill→生成并按需核验→展示结果→保存与导出。</w:t>
+      </w:r>
+    </w:p>
+    <w:p>
+      <w:pPr>
+        <w:ind w:firstLine="480"/>
+        <w:jc w:val="both"/>
+        <w:snapToGrid w:val="0"/>
+      </w:pPr>
+      <w:r>
+        <w:t>后端提取PDF文本、页面与图件信息，结合问题和阅读位置组织证据。讲解引用、PPT图件及方案依据与来源关联，支持用户对照和后续复核；内部评价记录产物与来源版本，便于追踪改进。</w:t>
+      </w:r>
+    </w:p>
+    <w:p>
+      <w:pPr>
+        <w:ind w:firstLine="480"/>
+        <w:jc w:val="both"/>
+        <w:snapToGrid w:val="0"/>
+      </w:pPr>
+      <w:r>
+        <w:t>系统支持本地部署，论文、对话和成果保存在本机，推理所需材料发送至用户配置的模型服务。当前提供Codex接入与独立兼容模型API接入。模型通信与教学规则分层组织，使更换模型时能够复用前后端与协作框架，再验证图像理解、结构化输出和教学表现。</w:t>
+      </w:r>
+    </w:p>
+    <w:p>
+      <w:pPr>
+        <w:pStyle w:val="Heading1"/>
+        <w:keepNext/>
+        <w:keepLines/>
+        <w:snapToGrid w:val="0"/>
+      </w:pPr>
+      <w:r>
+        <w:t>六、应用场景与验证</w:t>
+      </w:r>
+    </w:p>
+    <w:p>
+      <w:pPr>
+        <w:pStyle w:val="Heading2"/>
+        <w:keepNext/>
+        <w:keepLines/>
+        <w:snapToGrid w:val="0"/>
+      </w:pPr>
+      <w:r>
+        <w:t>（一）典型应用场景</w:t>
+      </w:r>
+    </w:p>
+    <w:p>
+      <w:pPr>
+        <w:keepLines/>
+        <w:ind w:left="480" w:hanging="480"/>
+        <w:jc w:val="both"/>
+        <w:snapToGrid w:val="0"/>
+      </w:pPr>
+      <w:r>
+        <w:rPr>
+          <w:b/>
+        </w:rPr>
+        <w:t>1．初入课题组：</w:t>
+      </w:r>
+      <w:r>
+        <w:t>导入导师推荐的论文，通过连续带读、图表对照和追问，理解研究方法与证据关系。</w:t>
+      </w:r>
+    </w:p>
+    <w:p>
+      <w:pPr>
+        <w:keepLines/>
+        <w:ind w:left="480" w:hanging="480"/>
+        <w:jc w:val="both"/>
+        <w:snapToGrid w:val="0"/>
+      </w:pPr>
+      <w:r>
+        <w:rPr>
+          <w:b/>
+        </w:rPr>
+        <w:t>2．准备组会汇报：</w:t>
+      </w:r>
+      <w:r>
+        <w:t>围绕论文生成PPT和讲述提示，梳理研究主线、关键实验、创新与不足，结合原文核对细节。</w:t>
+      </w:r>
+    </w:p>
+    <w:p>
+      <w:pPr>
+        <w:keepLines/>
+        <w:ind w:left="480" w:hanging="480"/>
+        <w:jc w:val="both"/>
+        <w:snapToGrid w:val="0"/>
+      </w:pPr>
+      <w:r>
+        <w:rPr>
+          <w:b/>
+        </w:rPr>
+        <w:t>3．讨论研究构思：</w:t>
+      </w:r>
+      <w:r>
+        <w:t>提供问题、参考论文和资源限制，通过方案草案整理研究对象、对照与分析思路，与导师进一步讨论。</w:t>
+      </w:r>
+    </w:p>
+    <w:p>
+      <w:pPr>
+        <w:pStyle w:val="Heading2"/>
+        <w:keepNext/>
+        <w:keepLines/>
+        <w:snapToGrid w:val="0"/>
+      </w:pPr>
+      <w:r>
+        <w:t>（二）验证与优化方式</w:t>
+      </w:r>
+    </w:p>
+    <w:p>
+      <w:pPr>
+        <w:ind w:firstLine="480"/>
+        <w:jc w:val="both"/>
+        <w:snapToGrid w:val="0"/>
+      </w:pPr>
+      <w:r>
+        <w:t>项目建立工程回归、使用流程和内部协作三类验证。工程回归检查数据、调度、导出等行为，并开展类型检查、构建与自动化测试；使用流程验证串联导入、带读、追问、图表对照及成果生成；内部协作验证结合模拟作答与交叉核验，比较规则表现。</w:t>
+      </w:r>
+    </w:p>
+    <w:p>
+      <w:pPr>
+        <w:ind w:firstLine="480"/>
+        <w:jc w:val="both"/>
+        <w:snapToGrid w:val="0"/>
+      </w:pPr>
+      <w:r>
+        <w:t>内部学习评价设置“未学习”“仅阅读材料”“材料加教学”等条件，为分析教学带来的帮助提供比较依据。项目已围绕阅读连续性、图件来源、PPT排版、方案条件保留、角色可见材料和补教复验等环节开展优化，将反馈落实到教学规则与执行流程。</w:t>
+      </w:r>
+    </w:p>
+    <w:p>
+      <w:pPr>
+        <w:ind w:firstLine="480"/>
+        <w:jc w:val="both"/>
+        <w:snapToGrid w:val="0"/>
+      </w:pPr>
+      <w:r>
+        <w:t>质量评价同时考虑科学准确性与学习体验。事实失实、关键条件遗漏和图件不对应等问题作为重点处理对象；讲解则关注层次、长度和可理解性，PPT关注图文布局与汇报节奏，方案关注条件完整性与设计理由。内部比较采用较细的检查维度，日常交付优先解决影响理解和使用的实质性问题，兼顾稳定性与效率。</w:t>
+      </w:r>
+    </w:p>
+    <w:p>
+      <w:pPr>
+        <w:pStyle w:val="Heading1"/>
+        <w:keepNext/>
+        <w:keepLines/>
+        <w:snapToGrid w:val="0"/>
+      </w:pPr>
+      <w:r>
+        <w:t>七、创新亮点</w:t>
+      </w:r>
+    </w:p>
+    <w:p>
+      <w:pPr>
+        <w:keepLines/>
+        <w:ind w:left="480" w:hanging="480"/>
+        <w:jc w:val="both"/>
+        <w:snapToGrid w:val="0"/>
+      </w:pPr>
+      <w:r>
+        <w:rPr>
+          <w:b/>
+        </w:rPr>
+        <w:t>1．以科研能力培养组织功能。</w:t>
+      </w:r>
+      <w:r>
+        <w:t>将论文理解、科研表达与研究构思连接起来，在具体任务中解释方法选择与证据推理，为初学者建立连续的学习路径。</w:t>
+      </w:r>
+    </w:p>
+    <w:p>
+      <w:pPr>
+        <w:keepLines/>
+        <w:ind w:left="480" w:hanging="480"/>
+        <w:jc w:val="both"/>
+        <w:snapToGrid w:val="0"/>
+      </w:pPr>
+      <w:r>
+        <w:rPr>
+          <w:b/>
+        </w:rPr>
+        <w:t>2．以新手表现反馈导师教学。</w:t>
+      </w:r>
+      <w:r>
+        <w:t>导师生成、新手模拟与来源核验共同参与质量改进，用理解断点和任务表现指导补教与修订。</w:t>
+      </w:r>
+    </w:p>
+    <w:p>
+      <w:pPr>
+        <w:keepLines/>
+        <w:ind w:left="480" w:hanging="480"/>
+        <w:jc w:val="both"/>
+        <w:snapToGrid w:val="0"/>
+      </w:pPr>
+      <w:r>
+        <w:rPr>
+          <w:b/>
+        </w:rPr>
+        <w:t>3．以三功能交叉验证检查应用与迁移。</w:t>
+      </w:r>
+      <w:r>
+        <w:t>将带读、PPT和方案作为相互检验的材料，结合原始证据和变化条件，检查内容准确性、表达完整性与设计合理性。</w:t>
+      </w:r>
+    </w:p>
+    <w:p>
+      <w:pPr>
+        <w:keepLines/>
+        <w:ind w:left="480" w:hanging="480"/>
+        <w:jc w:val="both"/>
+        <w:snapToGrid w:val="0"/>
+      </w:pPr>
+      <w:r>
+        <w:rPr>
+          <w:b/>
+        </w:rPr>
+        <w:t>4．以模块化Skill积累可复用能力。</w:t>
+      </w:r>
+      <w:r>
+        <w:t>将反馈定位到独立模块，通过候选比较持续改进，兼顾教学质量、开发效率与后续扩展，形成可维护的科研学习智能体。</w:t>
       </w:r>
     </w:p>
     <w:sectPr>
+      <w:footerReference w:type="default" r:id="rId9"/>
       <w:pgSz w:w="12240" w:h="15840"/>
-      <w:pgMar w:top="1152" w:right="1296" w:bottom="1152" w:left="1296" w:header="720" w:footer="720" w:gutter="0"/>
+      <w:pgMar w:top="1152" w:right="1296" w:bottom="1152" w:left="1296" w:header="720" w:footer="504" w:gutter="0"/>
       <w:cols w:space="720"/>
       <w:docGrid w:linePitch="360"/>
     </w:sectPr>
   </w:body>
 </w:document>
+</file>
+
+<file path=word/footer1.xml><?xml version="1.0" encoding="utf-8"?>
+<w:ftr xmlns:m="http://schemas.openxmlformats.org/officeDocument/2006/math" xmlns:mc="http://schemas.openxmlformats.org/markup-compatibility/2006" xmlns:mo="http://schemas.microsoft.com/office/mac/office/2008/main" xmlns:mv="urn:schemas-microsoft-com:mac:vml" xmlns:o="urn:schemas-microsoft-com:office:office" xmlns:r="http://schemas.openxmlformats.org/officeDocument/2006/relationships" xmlns:v="urn:schemas-microsoft-com:vml" xmlns:w10="urn:schemas-microsoft-com:office:word" xmlns:w14="http://schemas.microsoft.com/office/word/2010/wordml" xmlns:w="http://schemas.openxmlformats.org/wordprocessingml/2006/main" xmlns:wne="http://schemas.microsoft.com/office/word/2006/wordml" xmlns:wp14="http://schemas.microsoft.com/office/word/2010/wordprocessingDrawing" xmlns:wp="http://schemas.openxmlformats.org/drawingml/2006/wordprocessingDrawing" xmlns:wpc="http://schemas.microsoft.com/office/word/2010/wordprocessingCanvas" xmlns:wpg="http://schemas.microsoft.com/office/word/2010/wordprocessingGroup" xmlns:wpi="http://schemas.microsoft.com/office/word/2010/wordprocessingInk" xmlns:wps="http://schemas.microsoft.com/office/word/2010/wordprocessingShape" mc:Ignorable="w14 wp14">
+  <w:p>
+    <w:pPr>
+      <w:pStyle w:val="Footer"/>
+      <w:jc w:val="center"/>
+    </w:pPr>
+    <w:r>
+      <w:rPr>
+        <w:sz w:val="20"/>
+      </w:rPr>
+    </w:r>
+    <w:fldSimple w:instr="PAGE"/>
+  </w:p>
+</w:ftr>
 </file>
 
 <file path=word/numbering.xml><?xml version="1.0" encoding="utf-8"?>
@@ -982,10 +1343,12 @@
     <w:qFormat/>
     <w:rsid w:val="00FC693F"/>
     <w:pPr>
-      <w:spacing w:line="360" w:lineRule="auto" w:after="120"/>
+      <w:widowControl/>
+      <w:spacing w:line="360" w:lineRule="auto" w:after="0" w:before="0"/>
     </w:pPr>
     <w:rPr>
       <w:rFonts w:ascii="宋体" w:hAnsi="宋体" w:eastAsia="宋体"/>
+      <w:color w:val="000000"/>
       <w:sz w:val="24"/>
     </w:rPr>
   </w:style>
@@ -1044,14 +1407,15 @@
     <w:pPr>
       <w:keepNext/>
       <w:keepLines/>
-      <w:spacing w:before="480" w:after="0"/>
+      <w:widowControl/>
+      <w:spacing w:before="160" w:after="80" w:line="360" w:lineRule="auto"/>
       <w:outlineLvl w:val="0"/>
     </w:pPr>
     <w:rPr>
-      <w:rFonts w:asciiTheme="majorHAnsi" w:eastAsiaTheme="majorEastAsia" w:hAnsiTheme="majorHAnsi" w:cstheme="majorBidi"/>
+      <w:rFonts w:asciiTheme="majorHAnsi" w:eastAsiaTheme="majorEastAsia" w:hAnsiTheme="majorHAnsi" w:cstheme="majorBidi" w:ascii="黑体" w:hAnsi="黑体" w:eastAsia="黑体"/>
       <w:b/>
       <w:bCs/>
-      <w:color w:val="365F91" w:themeColor="accent1" w:themeShade="BF"/>
+      <w:color w:val="000000"/>
       <w:sz w:val="28"/>
       <w:szCs w:val="28"/>
     </w:rPr>
@@ -1068,15 +1432,16 @@
     <w:pPr>
       <w:keepNext/>
       <w:keepLines/>
-      <w:spacing w:before="200" w:after="0"/>
+      <w:widowControl/>
+      <w:spacing w:before="100" w:after="60" w:line="360" w:lineRule="auto"/>
       <w:outlineLvl w:val="1"/>
     </w:pPr>
     <w:rPr>
-      <w:rFonts w:asciiTheme="majorHAnsi" w:eastAsiaTheme="majorEastAsia" w:hAnsiTheme="majorHAnsi" w:cstheme="majorBidi"/>
+      <w:rFonts w:asciiTheme="majorHAnsi" w:eastAsiaTheme="majorEastAsia" w:hAnsiTheme="majorHAnsi" w:cstheme="majorBidi" w:ascii="宋体" w:hAnsi="宋体" w:eastAsia="宋体"/>
       <w:b/>
       <w:bCs/>
-      <w:color w:val="4F81BD" w:themeColor="accent1"/>
-      <w:sz w:val="26"/>
+      <w:color w:val="000000"/>
+      <w:sz w:val="24"/>
       <w:szCs w:val="26"/>
     </w:rPr>
   </w:style>
@@ -1330,18 +1695,19 @@
     <w:qFormat/>
     <w:rsid w:val="00FC693F"/>
     <w:pPr>
+      <w:widowControl/>
       <w:pBdr>
         <w:bottom w:val="single" w:sz="8" w:space="4" w:color="4F81BD" w:themeColor="accent1"/>
       </w:pBdr>
-      <w:spacing w:after="300" w:line="240" w:lineRule="auto"/>
+      <w:spacing w:after="240" w:line="360" w:lineRule="auto" w:before="0"/>
       <w:contextualSpacing/>
     </w:pPr>
     <w:rPr>
-      <w:rFonts w:asciiTheme="majorHAnsi" w:eastAsiaTheme="majorEastAsia" w:hAnsiTheme="majorHAnsi" w:cstheme="majorBidi"/>
-      <w:color w:val="17365D" w:themeColor="text2" w:themeShade="BF"/>
+      <w:rFonts w:asciiTheme="majorHAnsi" w:eastAsiaTheme="majorEastAsia" w:hAnsiTheme="majorHAnsi" w:cstheme="majorBidi" w:ascii="黑体" w:hAnsi="黑体" w:eastAsia="黑体"/>
+      <w:color w:val="000000"/>
       <w:spacing w:val="5"/>
       <w:kern w:val="28"/>
-      <w:sz w:val="52"/>
+      <w:sz w:val="32"/>
       <w:szCs w:val="52"/>
     </w:rPr>
   </w:style>

</xml_diff>

<commit_message>
Normalize design document fonts
</commit_message>
<xml_diff>
--- a/docs/医研导师设计说明.docx
+++ b/docs/医研导师设计说明.docx
@@ -9,10 +9,18 @@
         <w:snapToGrid w:val="0"/>
       </w:pPr>
       <w:r>
+        <w:rPr>
+          <w:rFonts w:ascii="Arial" w:hAnsi="Arial" w:eastAsia="黑体"/>
+          <w:sz w:val="32"/>
+        </w:rPr>
         <w:t>医研导师——</w:t>
         <w:br/>
       </w:r>
       <w:r>
+        <w:rPr>
+          <w:rFonts w:ascii="Arial" w:hAnsi="Arial" w:eastAsia="黑体"/>
+          <w:sz w:val="32"/>
+        </w:rPr>
         <w:t>面向医学科研初学者的智能体设计说明</w:t>
       </w:r>
     </w:p>
@@ -24,6 +32,10 @@
         <w:snapToGrid w:val="0"/>
       </w:pPr>
       <w:r>
+        <w:rPr>
+          <w:rFonts w:ascii="Arial" w:hAnsi="Arial" w:eastAsia="黑体"/>
+          <w:sz w:val="28"/>
+        </w:rPr>
         <w:t>一、设计背景与目标</w:t>
       </w:r>
     </w:p>
@@ -34,6 +46,10 @@
         <w:snapToGrid w:val="0"/>
       </w:pPr>
       <w:r>
+        <w:rPr>
+          <w:rFonts w:ascii="宋体" w:hAnsi="宋体" w:eastAsia="宋体"/>
+          <w:sz w:val="24"/>
+        </w:rPr>
         <w:t>医学科研初学者进入课题组后，常从阅读论文开始接触科研。理解论文既需要跨越英文术语障碍，也需要认识研究背景、理解方法原理、读懂图表，并判断实验结果如何支持结论。缺少科研训练的学生，即使知道论文做了什么，也往往难以解释为什么这样做，更难将其中的思路用于自己的研究问题。</w:t>
       </w:r>
     </w:p>
@@ -44,6 +60,10 @@
         <w:snapToGrid w:val="0"/>
       </w:pPr>
       <w:r>
+        <w:rPr>
+          <w:rFonts w:ascii="宋体" w:hAnsi="宋体" w:eastAsia="宋体"/>
+          <w:sz w:val="24"/>
+        </w:rPr>
         <w:t>医研导师面向本科大一至大五及研究生一年级阶段的医学科研初学者，以论文为学习载体，提供连续、可追问、可对照原文的科研学习支持。系统从研究背景、问题和价值切入，顺着论文展开，在关键实验、方法与图表处深入解释，将专业术语、对照设置、证据推理与研究局限融入具体情境，并允许用户调整讲解深浅。</w:t>
       </w:r>
     </w:p>
@@ -54,6 +74,10 @@
         <w:snapToGrid w:val="0"/>
       </w:pPr>
       <w:r>
+        <w:rPr>
+          <w:rFonts w:ascii="宋体" w:hAnsi="宋体" w:eastAsia="宋体"/>
+          <w:sz w:val="24"/>
+        </w:rPr>
         <w:t>作品围绕三个相互关联的目标展开：读懂研究，理解问题、方法与证据之间的关系；讲清研究，能够组织汇报并解释结论依据；尝试设计，能够结合新问题与实际条件，思考方法选择、对照设置和结果解释。</w:t>
       </w:r>
     </w:p>
@@ -64,6 +88,10 @@
         <w:snapToGrid w:val="0"/>
       </w:pPr>
       <w:r>
+        <w:rPr>
+          <w:rFonts w:ascii="宋体" w:hAnsi="宋体" w:eastAsia="宋体"/>
+          <w:sz w:val="24"/>
+        </w:rPr>
         <w:t>为此，系统设置论文精读带学、科研汇报PPT生成和研究方案构思三条主线，以模块化Skill组织能力，通过多Agent协作开展教学、模拟学习和来源核验，并利用内部交叉验证持续改进教学与生成规则。</w:t>
       </w:r>
     </w:p>
@@ -75,6 +103,10 @@
         <w:snapToGrid w:val="0"/>
       </w:pPr>
       <w:r>
+        <w:rPr>
+          <w:rFonts w:ascii="Arial" w:hAnsi="Arial" w:eastAsia="黑体"/>
+          <w:sz w:val="28"/>
+        </w:rPr>
         <w:t>二、核心功能与学习体验</w:t>
       </w:r>
     </w:p>
@@ -86,6 +118,10 @@
         <w:snapToGrid w:val="0"/>
       </w:pPr>
       <w:r>
+        <w:rPr>
+          <w:rFonts w:ascii="Arial" w:hAnsi="Arial" w:eastAsia="黑体"/>
+          <w:sz w:val="28"/>
+        </w:rPr>
         <w:t>（一）论文精读带学</w:t>
       </w:r>
     </w:p>
@@ -96,6 +132,10 @@
         <w:snapToGrid w:val="0"/>
       </w:pPr>
       <w:r>
+        <w:rPr>
+          <w:rFonts w:ascii="宋体" w:hAnsi="宋体" w:eastAsia="宋体"/>
+          <w:sz w:val="24"/>
+        </w:rPr>
         <w:t>用户导入医学论文PDF后，系统先介绍研究背景、核心问题与价值，再顺着论文展开讲解。在关键实验处，围绕“为什么做、如何做、设置了什么对照、结果说明什么”组织内容，将方法原理与研究目的联系起来，帮助初学者建立证据推理过程。</w:t>
       </w:r>
     </w:p>
@@ -106,6 +146,10 @@
         <w:snapToGrid w:val="0"/>
       </w:pPr>
       <w:r>
+        <w:rPr>
+          <w:rFonts w:ascii="宋体" w:hAnsi="宋体" w:eastAsia="宋体"/>
+          <w:sz w:val="24"/>
+        </w:rPr>
         <w:t>讲解采用小标题与分段表达，提供专业术语的中英文对应，支持原文、PDF页面和图表对照。初次接触一类图表时，重点解释坐标、分组和比较关系；随着阅读推进，更多关注数据含义与结论依据。用户可以随时要求展开、简化或选中一句话追问，再接回阅读主线。界面呈现当前与下一步阅读范围，使学习保持方向感和连贯性。</w:t>
       </w:r>
     </w:p>
@@ -116,6 +160,10 @@
         <w:snapToGrid w:val="0"/>
       </w:pPr>
       <w:r>
+        <w:rPr>
+          <w:rFonts w:ascii="宋体" w:hAnsi="宋体" w:eastAsia="宋体"/>
+          <w:sz w:val="24"/>
+        </w:rPr>
         <w:t>系统将科研思维融入具体讲解：解释结果时联系比较组和证据强度，讨论方法时说明适用条件，分析局限时指出其对结论的实际影响。用户可以沿着问题继续探索，也可以按正常节奏推进，使深入理解与阅读效率相互协调。</w:t>
       </w:r>
     </w:p>
@@ -127,6 +175,10 @@
         <w:snapToGrid w:val="0"/>
       </w:pPr>
       <w:r>
+        <w:rPr>
+          <w:rFonts w:ascii="Arial" w:hAnsi="Arial" w:eastAsia="黑体"/>
+          <w:sz w:val="28"/>
+        </w:rPr>
         <w:t>（二）科研汇报PPT生成</w:t>
       </w:r>
     </w:p>
@@ -137,6 +189,10 @@
         <w:snapToGrid w:val="0"/>
       </w:pPr>
       <w:r>
+        <w:rPr>
+          <w:rFonts w:ascii="宋体" w:hAnsi="宋体" w:eastAsia="宋体"/>
+          <w:sz w:val="24"/>
+        </w:rPr>
         <w:t>用户选择论文、填写汇报重点和页数需求后，系统围绕研究背景、实验设计、主要证据、创新与不足组织幻灯片，结合论文原图安排图文内容，使汇报具有清晰的叙述顺序。</w:t>
       </w:r>
     </w:p>
@@ -147,6 +203,10 @@
         <w:snapToGrid w:val="0"/>
       </w:pPr>
       <w:r>
+        <w:rPr>
+          <w:rFonts w:ascii="宋体" w:hAnsi="宋体" w:eastAsia="宋体"/>
+          <w:sz w:val="24"/>
+        </w:rPr>
         <w:t>页面内容与讲述提示分别组织：幻灯片呈现关键观点和证据，讲述提示帮助用户解释实验思路与结果。生成成果支持预览和可编辑PPTX导出，方便用户准备组会、修改页面及与导师交流。</w:t>
       </w:r>
     </w:p>
@@ -158,6 +218,10 @@
         <w:snapToGrid w:val="0"/>
       </w:pPr>
       <w:r>
+        <w:rPr>
+          <w:rFonts w:ascii="Arial" w:hAnsi="Arial" w:eastAsia="黑体"/>
+          <w:sz w:val="28"/>
+        </w:rPr>
         <w:t>（三）研究方案构思</w:t>
       </w:r>
     </w:p>
@@ -168,6 +232,10 @@
         <w:snapToGrid w:val="0"/>
       </w:pPr>
       <w:r>
+        <w:rPr>
+          <w:rFonts w:ascii="宋体" w:hAnsi="宋体" w:eastAsia="宋体"/>
+          <w:sz w:val="24"/>
+        </w:rPr>
         <w:t>用户提供研究方向、初步问题、已有资源与现实限制，并按需导入参考论文。系统据此组织研究目标、研究对象、方法选择、对照设置、测量指标和分析思路，形成可与导师讨论的方案草案。</w:t>
       </w:r>
     </w:p>
@@ -178,6 +246,10 @@
         <w:snapToGrid w:val="0"/>
       </w:pPr>
       <w:r>
+        <w:rPr>
+          <w:rFonts w:ascii="宋体" w:hAnsi="宋体" w:eastAsia="宋体"/>
+          <w:sz w:val="24"/>
+        </w:rPr>
         <w:t>方案强调设计理由与实际条件的联系。例如，当用户只有既往病历、无法新增随访时，研究问题、结局指标和分析方式需要随可用数据调整。系统通过呈现这些选择依据，帮助初学者理解如何从想法逐步形成研究设计。成果支持Word与Markdown导出。</w:t>
       </w:r>
     </w:p>
@@ -188,6 +260,10 @@
         <w:snapToGrid w:val="0"/>
       </w:pPr>
       <w:r>
+        <w:rPr>
+          <w:rFonts w:ascii="宋体" w:hAnsi="宋体" w:eastAsia="宋体"/>
+          <w:sz w:val="24"/>
+        </w:rPr>
         <w:t>三项功能可独立使用，也可围绕同一研究主题展开。系统按需利用文献检索补充资料，并区分题录、摘要与全文证据，为阅读和构思提供支持。</w:t>
       </w:r>
     </w:p>
@@ -199,6 +275,10 @@
         <w:snapToGrid w:val="0"/>
       </w:pPr>
       <w:r>
+        <w:rPr>
+          <w:rFonts w:ascii="Arial" w:hAnsi="Arial" w:eastAsia="黑体"/>
+          <w:sz w:val="28"/>
+        </w:rPr>
         <w:t>三、多Agent协作与三功能交叉验证</w:t>
       </w:r>
     </w:p>
@@ -210,6 +290,10 @@
         <w:snapToGrid w:val="0"/>
       </w:pPr>
       <w:r>
+        <w:rPr>
+          <w:rFonts w:ascii="Arial" w:hAnsi="Arial" w:eastAsia="黑体"/>
+          <w:sz w:val="28"/>
+        </w:rPr>
         <w:t>（一）以导师为主导的角色分工</w:t>
       </w:r>
     </w:p>
@@ -220,6 +304,10 @@
         <w:snapToGrid w:val="0"/>
       </w:pPr>
       <w:r>
+        <w:rPr>
+          <w:rFonts w:ascii="宋体" w:hAnsi="宋体" w:eastAsia="宋体"/>
+          <w:sz w:val="24"/>
+        </w:rPr>
         <w:t>医研导师以导师Agent为主Agent，主导教学与内容生成，由调度器组织新手模拟和来源核验两个Agent协作。</w:t>
       </w:r>
     </w:p>
@@ -232,11 +320,17 @@
       </w:pPr>
       <w:r>
         <w:rPr>
+          <w:rFonts w:ascii="宋体" w:hAnsi="宋体" w:eastAsia="宋体"/>
           <w:b/>
+          <w:sz w:val="24"/>
         </w:rPr>
         <w:t>1．导师Agent：</w:t>
       </w:r>
       <w:r>
+        <w:rPr>
+          <w:rFonts w:ascii="宋体" w:hAnsi="宋体" w:eastAsia="宋体"/>
+          <w:sz w:val="24"/>
+        </w:rPr>
         <w:t>组织讲解与成果生成，解释研究逻辑，根据反馈修订内容、开展针对性补教。</w:t>
       </w:r>
     </w:p>
@@ -249,11 +343,17 @@
       </w:pPr>
       <w:r>
         <w:rPr>
+          <w:rFonts w:ascii="宋体" w:hAnsi="宋体" w:eastAsia="宋体"/>
           <w:b/>
+          <w:sz w:val="24"/>
         </w:rPr>
         <w:t>2．新手模拟Agent：</w:t>
       </w:r>
       <w:r>
+        <w:rPr>
+          <w:rFonts w:ascii="宋体" w:hAnsi="宋体" w:eastAsia="宋体"/>
+          <w:sz w:val="24"/>
+        </w:rPr>
         <w:t>从初学者视角试读，完成复述、汇报和设计任务，暴露理解断点与应用困难。</w:t>
       </w:r>
     </w:p>
@@ -266,11 +366,17 @@
       </w:pPr>
       <w:r>
         <w:rPr>
+          <w:rFonts w:ascii="宋体" w:hAnsi="宋体" w:eastAsia="宋体"/>
           <w:b/>
+          <w:sz w:val="24"/>
         </w:rPr>
         <w:t>3．来源核验Agent：</w:t>
       </w:r>
       <w:r>
+        <w:rPr>
+          <w:rFonts w:ascii="宋体" w:hAnsi="宋体" w:eastAsia="宋体"/>
+          <w:sz w:val="24"/>
+        </w:rPr>
         <w:t>对照原文、图表及任务条件，检查事实、引用与结论依据，评价产物和新手作答。</w:t>
       </w:r>
     </w:p>
@@ -281,6 +387,10 @@
         <w:snapToGrid w:val="0"/>
       </w:pPr>
       <w:r>
+        <w:rPr>
+          <w:rFonts w:ascii="宋体" w:hAnsi="宋体" w:eastAsia="宋体"/>
+          <w:sz w:val="24"/>
+        </w:rPr>
         <w:t>调度器根据任务组合角色与Skill，汇总问题并组织修订、复读和复核，同时管理执行顺序、预算与运行记录。日常使用按需调用，内部迭代围绕具体问题运行完整验证流程。</w:t>
       </w:r>
     </w:p>
@@ -291,6 +401,10 @@
         <w:snapToGrid w:val="0"/>
       </w:pPr>
       <w:r>
+        <w:rPr>
+          <w:rFonts w:ascii="宋体" w:hAnsi="宋体" w:eastAsia="宋体"/>
+          <w:sz w:val="24"/>
+        </w:rPr>
         <w:t>新手模拟围绕设定的学习基础和已接触材料展开，重点观察概念是否理解、推理能否衔接、结论能否解释。核验角色则依据原始材料检查作答，定位到具体语句、图件或实验条件。两类反馈汇总后，导师可以针对理解问题补充解释，针对证据问题修正表述，使修订具有明确目标。</w:t>
       </w:r>
     </w:p>
@@ -302,6 +416,10 @@
         <w:snapToGrid w:val="0"/>
       </w:pPr>
       <w:r>
+        <w:rPr>
+          <w:rFonts w:ascii="Arial" w:hAnsi="Arial" w:eastAsia="黑体"/>
+          <w:sz w:val="28"/>
+        </w:rPr>
         <w:t>（二）用汇报任务同时检验材料与学习表现</w:t>
       </w:r>
     </w:p>
@@ -312,6 +430,10 @@
         <w:snapToGrid w:val="0"/>
       </w:pPr>
       <w:r>
+        <w:rPr>
+          <w:rFonts w:ascii="宋体" w:hAnsi="宋体" w:eastAsia="宋体"/>
+          <w:sz w:val="24"/>
+        </w:rPr>
         <w:t>论文带读、PPT和研究方案分别承载理解、表达与设计任务。内部迭代将三类产物与原始来源关联起来，检查证据一致性，并观察模拟新手能否使用材料完成任务。</w:t>
       </w:r>
     </w:p>
@@ -322,6 +444,10 @@
         <w:snapToGrid w:val="0"/>
       </w:pPr>
       <w:r>
+        <w:rPr>
+          <w:rFonts w:ascii="宋体" w:hAnsi="宋体" w:eastAsia="宋体"/>
+          <w:sz w:val="24"/>
+        </w:rPr>
         <w:t>例如，导师讲解某项实验后，系统生成对应汇报材料，再让模拟新手组织文字汇报提纲或讲述内容，解释实验目的、对照设置和结果依据。如果新手只能复述结论，却说不清比较组的作用，系统便回查带读是否遗漏了设计理由、PPT是否在压缩内容时删去了关键条件。导师据此补教或修订，再由新手重新作答、核验角色检查改善情况。</w:t>
       </w:r>
     </w:p>
@@ -332,6 +458,10 @@
         <w:snapToGrid w:val="0"/>
       </w:pPr>
       <w:r>
+        <w:rPr>
+          <w:rFonts w:ascii="宋体" w:hAnsi="宋体" w:eastAsia="宋体"/>
+          <w:sz w:val="24"/>
+        </w:rPr>
         <w:t>这一过程同时检验汇报材料的表达效果与模拟新手的学习表现。汇报提纲等任务要求重新组织内容，以观察对研究主线和证据关系的掌握。PPT中暴露的问题可以反馈到带读，教学中的理解断点也能指导汇报材料改进。</w:t>
       </w:r>
     </w:p>
@@ -342,6 +472,10 @@
         <w:snapToGrid w:val="0"/>
       </w:pPr>
       <w:r>
+        <w:rPr>
+          <w:rFonts w:ascii="宋体" w:hAnsi="宋体" w:eastAsia="宋体"/>
+          <w:sz w:val="24"/>
+        </w:rPr>
         <w:t>交叉检查还关注成果转换中的信息损失。例如，带读已经解释了研究对象的适用范围，汇报页面在提炼结论时也需要保留这一条件；研究方案借鉴相关方法时，则需重新判断其是否适合新的对象和资源。三个功能由此共享证据要求，同时分别承担理解、表达和应用的检验任务。</w:t>
       </w:r>
     </w:p>
@@ -353,6 +487,10 @@
         <w:snapToGrid w:val="0"/>
       </w:pPr>
       <w:r>
+        <w:rPr>
+          <w:rFonts w:ascii="Arial" w:hAnsi="Arial" w:eastAsia="黑体"/>
+          <w:sz w:val="28"/>
+        </w:rPr>
         <w:t>（三）用研究设计任务检查知识迁移</w:t>
       </w:r>
     </w:p>
@@ -363,6 +501,10 @@
         <w:snapToGrid w:val="0"/>
       </w:pPr>
       <w:r>
+        <w:rPr>
+          <w:rFonts w:ascii="宋体" w:hAnsi="宋体" w:eastAsia="宋体"/>
+          <w:sz w:val="24"/>
+        </w:rPr>
         <w:t>内部流程进一步改变研究人群、可用资源、观察时间或结局条件，让模拟新手尝试形成新的研究设计。</w:t>
       </w:r>
     </w:p>
@@ -373,6 +515,10 @@
         <w:snapToGrid w:val="0"/>
       </w:pPr>
       <w:r>
+        <w:rPr>
+          <w:rFonts w:ascii="宋体" w:hAnsi="宋体" w:eastAsia="宋体"/>
+          <w:sz w:val="24"/>
+        </w:rPr>
         <w:t>例如，原论文使用长期随访数据，新任务只有一次体检记录，新手就需要重新考虑可回答的问题、变量的时间关系与结论范围。核验角色结合新条件评价设计；发现机械照搬原研究的情况后，导师围绕相应方法和证据问题补教，再开展复验。</w:t>
       </w:r>
     </w:p>
@@ -383,6 +529,10 @@
         <w:snapToGrid w:val="0"/>
       </w:pPr>
       <w:r>
+        <w:rPr>
+          <w:rFonts w:ascii="宋体" w:hAnsi="宋体" w:eastAsia="宋体"/>
+          <w:sz w:val="24"/>
+        </w:rPr>
         <w:t>方案中的困难也会反馈到带读与汇报：方法条件是否讲清、关键限制是否保留、概念能否用于新情境，都成为后续优化的依据。</w:t>
       </w:r>
     </w:p>
@@ -394,6 +544,10 @@
         <w:snapToGrid w:val="0"/>
       </w:pPr>
       <w:r>
+        <w:rPr>
+          <w:rFonts w:ascii="Arial" w:hAnsi="Arial" w:eastAsia="黑体"/>
+          <w:sz w:val="28"/>
+        </w:rPr>
         <w:t>（四）将交叉反馈落实到内部迭代</w:t>
       </w:r>
     </w:p>
@@ -404,6 +558,10 @@
         <w:snapToGrid w:val="0"/>
       </w:pPr>
       <w:r>
+        <w:rPr>
+          <w:rFonts w:ascii="宋体" w:hAnsi="宋体" w:eastAsia="宋体"/>
+          <w:sz w:val="24"/>
+        </w:rPr>
         <w:t>内部闭环按照“生成产物—交叉核验—新手作答—补教修订—复验与迁移”展开。跨产物核验关联原始来源，检查事实、实验条件、图件和结论的表达，并区分已有研究结果与新方案假设。</w:t>
       </w:r>
     </w:p>
@@ -414,6 +572,10 @@
         <w:snapToGrid w:val="0"/>
       </w:pPr>
       <w:r>
+        <w:rPr>
+          <w:rFonts w:ascii="宋体" w:hAnsi="宋体" w:eastAsia="宋体"/>
+          <w:sz w:val="24"/>
+        </w:rPr>
         <w:t>迭代结合小样本与完整论文：小样本快速定位术语、读图和对照理解等问题；完整论文检查讲解连贯性与汇报逻辑；跨功能任务检查表达和设计中的应用表现。内部迭代主要优化Skill、提示规则与协作流程，改进候选经比较验证后用于后续服务。完整交叉流程主要用于内部质量迭代，用户可按当前需求使用单项功能。</w:t>
       </w:r>
     </w:p>
@@ -424,6 +586,10 @@
         <w:snapToGrid w:val="0"/>
       </w:pPr>
       <w:r>
+        <w:rPr>
+          <w:rFonts w:ascii="宋体" w:hAnsi="宋体" w:eastAsia="宋体"/>
+          <w:sz w:val="24"/>
+        </w:rPr>
         <w:t>每轮比较保留材料、规则版本、模型配置与运行记录，将当前规则作为基线，将修改后的规则作为候选。候选规则在独立快照中验证，评价内容与作答所需材料分开组织，减少答案提示对模拟表现的影响。通过比较与发布检查后，采用的规则才进入实际服务，使局部调整有据可查，也便于发现改善是否伴随其他能力退步。</w:t>
       </w:r>
     </w:p>
@@ -435,6 +601,10 @@
         <w:snapToGrid w:val="0"/>
       </w:pPr>
       <w:r>
+        <w:rPr>
+          <w:rFonts w:ascii="Arial" w:hAnsi="Arial" w:eastAsia="黑体"/>
+          <w:sz w:val="28"/>
+        </w:rPr>
         <w:t>四、Skill模块化设计</w:t>
       </w:r>
     </w:p>
@@ -446,6 +616,10 @@
         <w:snapToGrid w:val="0"/>
       </w:pPr>
       <w:r>
+        <w:rPr>
+          <w:rFonts w:ascii="Arial" w:hAnsi="Arial" w:eastAsia="黑体"/>
+          <w:sz w:val="28"/>
+        </w:rPr>
         <w:t>（一）按能力拆分，按任务组合</w:t>
       </w:r>
     </w:p>
@@ -456,6 +630,10 @@
         <w:snapToGrid w:val="0"/>
       </w:pPr>
       <w:r>
+        <w:rPr>
+          <w:rFonts w:ascii="宋体" w:hAnsi="宋体" w:eastAsia="宋体"/>
+          <w:sz w:val="24"/>
+        </w:rPr>
         <w:t>系统将教学与生成能力拆分为11个Skill，明确职责、输入、输出与质量要求，并通过共享规则统一教学和证据标准。</w:t>
       </w:r>
     </w:p>
@@ -468,11 +646,17 @@
       </w:pPr>
       <w:r>
         <w:rPr>
+          <w:rFonts w:ascii="宋体" w:hAnsi="宋体" w:eastAsia="宋体"/>
           <w:b/>
+          <w:sz w:val="24"/>
         </w:rPr>
         <w:t>1．科研学习主助手：</w:t>
       </w:r>
       <w:r>
+        <w:rPr>
+          <w:rFonts w:ascii="宋体" w:hAnsi="宋体" w:eastAsia="宋体"/>
+          <w:sz w:val="24"/>
+        </w:rPr>
         <w:t>理解用户目标，组织任务与后续追问。</w:t>
       </w:r>
     </w:p>
@@ -485,11 +669,17 @@
       </w:pPr>
       <w:r>
         <w:rPr>
+          <w:rFonts w:ascii="宋体" w:hAnsi="宋体" w:eastAsia="宋体"/>
           <w:b/>
+          <w:sz w:val="24"/>
         </w:rPr>
         <w:t>2．论文带读：</w:t>
       </w:r>
       <w:r>
+        <w:rPr>
+          <w:rFonts w:ascii="宋体" w:hAnsi="宋体" w:eastAsia="宋体"/>
+          <w:sz w:val="24"/>
+        </w:rPr>
         <w:t>串联背景、问题、方法、结果和讨论。</w:t>
       </w:r>
     </w:p>
@@ -502,11 +692,17 @@
       </w:pPr>
       <w:r>
         <w:rPr>
+          <w:rFonts w:ascii="宋体" w:hAnsi="宋体" w:eastAsia="宋体"/>
           <w:b/>
+          <w:sz w:val="24"/>
         </w:rPr>
         <w:t>3．证据链：</w:t>
       </w:r>
       <w:r>
+        <w:rPr>
+          <w:rFonts w:ascii="宋体" w:hAnsi="宋体" w:eastAsia="宋体"/>
+          <w:sz w:val="24"/>
+        </w:rPr>
         <w:t>连接研究问题、实验、结果与结论。</w:t>
       </w:r>
     </w:p>
@@ -519,11 +715,17 @@
       </w:pPr>
       <w:r>
         <w:rPr>
+          <w:rFonts w:ascii="宋体" w:hAnsi="宋体" w:eastAsia="宋体"/>
           <w:b/>
+          <w:sz w:val="24"/>
         </w:rPr>
         <w:t>4．方法教学：</w:t>
       </w:r>
       <w:r>
+        <w:rPr>
+          <w:rFonts w:ascii="宋体" w:hAnsi="宋体" w:eastAsia="宋体"/>
+          <w:sz w:val="24"/>
+        </w:rPr>
         <w:t>解释方法原理、实验目的与对照设计。</w:t>
       </w:r>
     </w:p>
@@ -536,11 +738,17 @@
       </w:pPr>
       <w:r>
         <w:rPr>
+          <w:rFonts w:ascii="宋体" w:hAnsi="宋体" w:eastAsia="宋体"/>
           <w:b/>
+          <w:sz w:val="24"/>
         </w:rPr>
         <w:t>5．图表教学：</w:t>
       </w:r>
       <w:r>
+        <w:rPr>
+          <w:rFonts w:ascii="宋体" w:hAnsi="宋体" w:eastAsia="宋体"/>
+          <w:sz w:val="24"/>
+        </w:rPr>
         <w:t>解释坐标、分组、统计及数据含义。</w:t>
       </w:r>
     </w:p>
@@ -553,11 +761,17 @@
       </w:pPr>
       <w:r>
         <w:rPr>
+          <w:rFonts w:ascii="宋体" w:hAnsi="宋体" w:eastAsia="宋体"/>
           <w:b/>
+          <w:sz w:val="24"/>
         </w:rPr>
         <w:t>6．术语解释：</w:t>
       </w:r>
       <w:r>
+        <w:rPr>
+          <w:rFonts w:ascii="宋体" w:hAnsi="宋体" w:eastAsia="宋体"/>
+          <w:sz w:val="24"/>
+        </w:rPr>
         <w:t>提供中英文对应与语境化解释。</w:t>
       </w:r>
     </w:p>
@@ -570,11 +784,17 @@
       </w:pPr>
       <w:r>
         <w:rPr>
+          <w:rFonts w:ascii="宋体" w:hAnsi="宋体" w:eastAsia="宋体"/>
           <w:b/>
+          <w:sz w:val="24"/>
         </w:rPr>
         <w:t>7．论文汇报PPT：</w:t>
       </w:r>
       <w:r>
+        <w:rPr>
+          <w:rFonts w:ascii="宋体" w:hAnsi="宋体" w:eastAsia="宋体"/>
+          <w:sz w:val="24"/>
+        </w:rPr>
         <w:t>组织汇报主线、图文内容与讲述提示。</w:t>
       </w:r>
     </w:p>
@@ -587,11 +807,17 @@
       </w:pPr>
       <w:r>
         <w:rPr>
+          <w:rFonts w:ascii="宋体" w:hAnsi="宋体" w:eastAsia="宋体"/>
           <w:b/>
+          <w:sz w:val="24"/>
         </w:rPr>
         <w:t>8．医学研究方案：</w:t>
       </w:r>
       <w:r>
+        <w:rPr>
+          <w:rFonts w:ascii="宋体" w:hAnsi="宋体" w:eastAsia="宋体"/>
+          <w:sz w:val="24"/>
+        </w:rPr>
         <w:t>根据问题、参考材料与限制组织方案。</w:t>
       </w:r>
     </w:p>
@@ -604,11 +830,17 @@
       </w:pPr>
       <w:r>
         <w:rPr>
+          <w:rFonts w:ascii="宋体" w:hAnsi="宋体" w:eastAsia="宋体"/>
           <w:b/>
+          <w:sz w:val="24"/>
         </w:rPr>
         <w:t>9．来源核验：</w:t>
       </w:r>
       <w:r>
+        <w:rPr>
+          <w:rFonts w:ascii="宋体" w:hAnsi="宋体" w:eastAsia="宋体"/>
+          <w:sz w:val="24"/>
+        </w:rPr>
         <w:t>检查事实、引用与证据支持。</w:t>
       </w:r>
     </w:p>
@@ -621,11 +853,17 @@
       </w:pPr>
       <w:r>
         <w:rPr>
+          <w:rFonts w:ascii="宋体" w:hAnsi="宋体" w:eastAsia="宋体"/>
           <w:b/>
+          <w:sz w:val="24"/>
         </w:rPr>
         <w:t>10．新手试读模拟：</w:t>
       </w:r>
       <w:r>
+        <w:rPr>
+          <w:rFonts w:ascii="宋体" w:hAnsi="宋体" w:eastAsia="宋体"/>
+          <w:sz w:val="24"/>
+        </w:rPr>
         <w:t>识别术语障碍、推理跳步和理解断点。</w:t>
       </w:r>
     </w:p>
@@ -638,11 +876,17 @@
       </w:pPr>
       <w:r>
         <w:rPr>
+          <w:rFonts w:ascii="宋体" w:hAnsi="宋体" w:eastAsia="宋体"/>
           <w:b/>
+          <w:sz w:val="24"/>
         </w:rPr>
         <w:t>11．学习者任务模拟：</w:t>
       </w:r>
       <w:r>
+        <w:rPr>
+          <w:rFonts w:ascii="宋体" w:hAnsi="宋体" w:eastAsia="宋体"/>
+          <w:sz w:val="24"/>
+        </w:rPr>
         <w:t>支持模拟作答，为学习与迁移评价提供输入。</w:t>
       </w:r>
     </w:p>
@@ -653,6 +897,10 @@
         <w:snapToGrid w:val="0"/>
       </w:pPr>
       <w:r>
+        <w:rPr>
+          <w:rFonts w:ascii="宋体" w:hAnsi="宋体" w:eastAsia="宋体"/>
+          <w:sz w:val="24"/>
+        </w:rPr>
         <w:t>Skill与Agent采用灵活的组合关系。例如，导师解释实验图时，可组合图表教学、方法教学和证据链；制作汇报时，再调用PPT模块。共同的核验规则使不同成果在事实与推理要求上保持一致。</w:t>
       </w:r>
     </w:p>
@@ -664,6 +912,10 @@
         <w:snapToGrid w:val="0"/>
       </w:pPr>
       <w:r>
+        <w:rPr>
+          <w:rFonts w:ascii="Arial" w:hAnsi="Arial" w:eastAsia="黑体"/>
+          <w:sz w:val="28"/>
+        </w:rPr>
         <w:t>（二）定向改进，降低开发维护成本</w:t>
       </w:r>
     </w:p>
@@ -674,6 +926,10 @@
         <w:snapToGrid w:val="0"/>
       </w:pPr>
       <w:r>
+        <w:rPr>
+          <w:rFonts w:ascii="宋体" w:hAnsi="宋体" w:eastAsia="宋体"/>
+          <w:sz w:val="24"/>
+        </w:rPr>
         <w:t>模块化使反馈能够定位到具体能力：对照理解困难可以调整方法教学，PPT遗漏条件可以优化汇报与证据链，方案忽略资源限制可以改进条件分析规则。候选版本在相同材料与任务上进行比较，再通过完整论文和跨功能任务检查整体表现。</w:t>
       </w:r>
     </w:p>
@@ -684,6 +940,10 @@
         <w:snapToGrid w:val="0"/>
       </w:pPr>
       <w:r>
+        <w:rPr>
+          <w:rFonts w:ascii="宋体" w:hAnsi="宋体" w:eastAsia="宋体"/>
+          <w:sz w:val="24"/>
+        </w:rPr>
         <w:t>共享模块减少重复编写规则的工作，局部修改缩短问题定位、调整与验证的路径。扩展医学方向或适配其他模型时，可以复用现有框架，集中调整相关模块与接入配置，使有限的开发时间和迭代资源用于改善具体能力。</w:t>
       </w:r>
     </w:p>
@@ -694,6 +954,10 @@
         <w:snapToGrid w:val="0"/>
       </w:pPr>
       <w:r>
+        <w:rPr>
+          <w:rFonts w:ascii="宋体" w:hAnsi="宋体" w:eastAsia="宋体"/>
+          <w:sz w:val="24"/>
+        </w:rPr>
         <w:t>共享规则负责不同任务都需要遵循的教学和证据原则，各Skill补充具体任务的方法与输出要求。这种分层使共同要求能够统一维护，任务差异能够分别优化，也便于检查一次规则变更会影响哪些功能。</w:t>
       </w:r>
     </w:p>
@@ -705,6 +969,10 @@
         <w:snapToGrid w:val="0"/>
       </w:pPr>
       <w:r>
+        <w:rPr>
+          <w:rFonts w:ascii="Arial" w:hAnsi="Arial" w:eastAsia="黑体"/>
+          <w:sz w:val="28"/>
+        </w:rPr>
         <w:t>五、技术架构与运行流程</w:t>
       </w:r>
     </w:p>
@@ -715,6 +983,10 @@
         <w:snapToGrid w:val="0"/>
       </w:pPr>
       <w:r>
+        <w:rPr>
+          <w:rFonts w:ascii="宋体" w:hAnsi="宋体" w:eastAsia="宋体"/>
+          <w:sz w:val="24"/>
+        </w:rPr>
         <w:t>系统采用前后端分离架构，通过本地网页提供使用入口。React与Vite前端承载阅读、追问、原文图表对照和成果预览；Express与TypeScript后端负责论文解析、模型调用、Agent调度、Skill加载、数据保存及文件导出。</w:t>
       </w:r>
     </w:p>
@@ -725,6 +997,10 @@
         <w:snapToGrid w:val="0"/>
       </w:pPr>
       <w:r>
+        <w:rPr>
+          <w:rFonts w:ascii="宋体" w:hAnsi="宋体" w:eastAsia="宋体"/>
+          <w:sz w:val="24"/>
+        </w:rPr>
         <w:t>整体分为四层：用户交互层提供阅读与生成工作区；任务调度层组织角色、规则和执行流程；模型与能力层完成讲解、生成、模拟与核验；资料与成果层管理论文来源、对话记录和生成版本。</w:t>
       </w:r>
     </w:p>
@@ -735,6 +1011,10 @@
         <w:snapToGrid w:val="0"/>
       </w:pPr>
       <w:r>
+        <w:rPr>
+          <w:rFonts w:ascii="宋体" w:hAnsi="宋体" w:eastAsia="宋体"/>
+          <w:sz w:val="24"/>
+        </w:rPr>
         <w:t>基本运行流程为：导入论文与提出需求→组织相关材料→调度角色与Skill→生成并按需核验→展示结果→保存与导出。</w:t>
       </w:r>
     </w:p>
@@ -745,6 +1025,10 @@
         <w:snapToGrid w:val="0"/>
       </w:pPr>
       <w:r>
+        <w:rPr>
+          <w:rFonts w:ascii="宋体" w:hAnsi="宋体" w:eastAsia="宋体"/>
+          <w:sz w:val="24"/>
+        </w:rPr>
         <w:t>后端提取PDF文本、页面与图件信息，结合问题和阅读位置组织证据。讲解引用、PPT图件及方案依据与来源关联，支持用户对照和后续复核；内部评价记录产物与来源版本，便于追踪改进。</w:t>
       </w:r>
     </w:p>
@@ -755,6 +1039,10 @@
         <w:snapToGrid w:val="0"/>
       </w:pPr>
       <w:r>
+        <w:rPr>
+          <w:rFonts w:ascii="宋体" w:hAnsi="宋体" w:eastAsia="宋体"/>
+          <w:sz w:val="24"/>
+        </w:rPr>
         <w:t>系统支持本地部署，论文、对话和成果保存在本机，推理所需材料发送至用户配置的模型服务。当前提供Codex接入与独立兼容模型API接入。模型通信与教学规则分层组织，使更换模型时能够复用前后端与协作框架，再验证图像理解、结构化输出和教学表现。</w:t>
       </w:r>
     </w:p>
@@ -766,6 +1054,10 @@
         <w:snapToGrid w:val="0"/>
       </w:pPr>
       <w:r>
+        <w:rPr>
+          <w:rFonts w:ascii="Arial" w:hAnsi="Arial" w:eastAsia="黑体"/>
+          <w:sz w:val="28"/>
+        </w:rPr>
         <w:t>六、应用场景与验证</w:t>
       </w:r>
     </w:p>
@@ -777,6 +1069,10 @@
         <w:snapToGrid w:val="0"/>
       </w:pPr>
       <w:r>
+        <w:rPr>
+          <w:rFonts w:ascii="Arial" w:hAnsi="Arial" w:eastAsia="黑体"/>
+          <w:sz w:val="28"/>
+        </w:rPr>
         <w:t>（一）典型应用场景</w:t>
       </w:r>
     </w:p>
@@ -789,11 +1085,17 @@
       </w:pPr>
       <w:r>
         <w:rPr>
+          <w:rFonts w:ascii="宋体" w:hAnsi="宋体" w:eastAsia="宋体"/>
           <w:b/>
+          <w:sz w:val="24"/>
         </w:rPr>
         <w:t>1．初入课题组：</w:t>
       </w:r>
       <w:r>
+        <w:rPr>
+          <w:rFonts w:ascii="宋体" w:hAnsi="宋体" w:eastAsia="宋体"/>
+          <w:sz w:val="24"/>
+        </w:rPr>
         <w:t>导入导师推荐的论文，通过连续带读、图表对照和追问，理解研究方法与证据关系。</w:t>
       </w:r>
     </w:p>
@@ -806,11 +1108,17 @@
       </w:pPr>
       <w:r>
         <w:rPr>
+          <w:rFonts w:ascii="宋体" w:hAnsi="宋体" w:eastAsia="宋体"/>
           <w:b/>
+          <w:sz w:val="24"/>
         </w:rPr>
         <w:t>2．准备组会汇报：</w:t>
       </w:r>
       <w:r>
+        <w:rPr>
+          <w:rFonts w:ascii="宋体" w:hAnsi="宋体" w:eastAsia="宋体"/>
+          <w:sz w:val="24"/>
+        </w:rPr>
         <w:t>围绕论文生成PPT和讲述提示，梳理研究主线、关键实验、创新与不足，结合原文核对细节。</w:t>
       </w:r>
     </w:p>
@@ -823,11 +1131,17 @@
       </w:pPr>
       <w:r>
         <w:rPr>
+          <w:rFonts w:ascii="宋体" w:hAnsi="宋体" w:eastAsia="宋体"/>
           <w:b/>
+          <w:sz w:val="24"/>
         </w:rPr>
         <w:t>3．讨论研究构思：</w:t>
       </w:r>
       <w:r>
+        <w:rPr>
+          <w:rFonts w:ascii="宋体" w:hAnsi="宋体" w:eastAsia="宋体"/>
+          <w:sz w:val="24"/>
+        </w:rPr>
         <w:t>提供问题、参考论文和资源限制，通过方案草案整理研究对象、对照与分析思路，与导师进一步讨论。</w:t>
       </w:r>
     </w:p>
@@ -839,6 +1153,10 @@
         <w:snapToGrid w:val="0"/>
       </w:pPr>
       <w:r>
+        <w:rPr>
+          <w:rFonts w:ascii="Arial" w:hAnsi="Arial" w:eastAsia="黑体"/>
+          <w:sz w:val="28"/>
+        </w:rPr>
         <w:t>（二）验证与优化方式</w:t>
       </w:r>
     </w:p>
@@ -849,6 +1167,10 @@
         <w:snapToGrid w:val="0"/>
       </w:pPr>
       <w:r>
+        <w:rPr>
+          <w:rFonts w:ascii="宋体" w:hAnsi="宋体" w:eastAsia="宋体"/>
+          <w:sz w:val="24"/>
+        </w:rPr>
         <w:t>项目建立工程回归、使用流程和内部协作三类验证。工程回归检查数据、调度、导出等行为，并开展类型检查、构建与自动化测试；使用流程验证串联导入、带读、追问、图表对照及成果生成；内部协作验证结合模拟作答与交叉核验，比较规则表现。</w:t>
       </w:r>
     </w:p>
@@ -859,6 +1181,10 @@
         <w:snapToGrid w:val="0"/>
       </w:pPr>
       <w:r>
+        <w:rPr>
+          <w:rFonts w:ascii="宋体" w:hAnsi="宋体" w:eastAsia="宋体"/>
+          <w:sz w:val="24"/>
+        </w:rPr>
         <w:t>内部学习评价设置“未学习”“仅阅读材料”“材料加教学”等条件，为分析教学带来的帮助提供比较依据。项目已围绕阅读连续性、图件来源、PPT排版、方案条件保留、角色可见材料和补教复验等环节开展优化，将反馈落实到教学规则与执行流程。</w:t>
       </w:r>
     </w:p>
@@ -869,6 +1195,10 @@
         <w:snapToGrid w:val="0"/>
       </w:pPr>
       <w:r>
+        <w:rPr>
+          <w:rFonts w:ascii="宋体" w:hAnsi="宋体" w:eastAsia="宋体"/>
+          <w:sz w:val="24"/>
+        </w:rPr>
         <w:t>质量评价同时考虑科学准确性与学习体验。事实失实、关键条件遗漏和图件不对应等问题作为重点处理对象；讲解则关注层次、长度和可理解性，PPT关注图文布局与汇报节奏，方案关注条件完整性与设计理由。内部比较采用较细的检查维度，日常交付优先解决影响理解和使用的实质性问题，兼顾稳定性与效率。</w:t>
       </w:r>
     </w:p>
@@ -880,6 +1210,10 @@
         <w:snapToGrid w:val="0"/>
       </w:pPr>
       <w:r>
+        <w:rPr>
+          <w:rFonts w:ascii="Arial" w:hAnsi="Arial" w:eastAsia="黑体"/>
+          <w:sz w:val="28"/>
+        </w:rPr>
         <w:t>七、创新亮点</w:t>
       </w:r>
     </w:p>
@@ -892,11 +1226,17 @@
       </w:pPr>
       <w:r>
         <w:rPr>
+          <w:rFonts w:ascii="宋体" w:hAnsi="宋体" w:eastAsia="宋体"/>
           <w:b/>
+          <w:sz w:val="24"/>
         </w:rPr>
         <w:t>1．以科研能力培养组织功能。</w:t>
       </w:r>
       <w:r>
+        <w:rPr>
+          <w:rFonts w:ascii="宋体" w:hAnsi="宋体" w:eastAsia="宋体"/>
+          <w:sz w:val="24"/>
+        </w:rPr>
         <w:t>将论文理解、科研表达与研究构思连接起来，在具体任务中解释方法选择与证据推理，为初学者建立连续的学习路径。</w:t>
       </w:r>
     </w:p>
@@ -909,11 +1249,17 @@
       </w:pPr>
       <w:r>
         <w:rPr>
+          <w:rFonts w:ascii="宋体" w:hAnsi="宋体" w:eastAsia="宋体"/>
           <w:b/>
+          <w:sz w:val="24"/>
         </w:rPr>
         <w:t>2．以新手表现反馈导师教学。</w:t>
       </w:r>
       <w:r>
+        <w:rPr>
+          <w:rFonts w:ascii="宋体" w:hAnsi="宋体" w:eastAsia="宋体"/>
+          <w:sz w:val="24"/>
+        </w:rPr>
         <w:t>导师生成、新手模拟与来源核验共同参与质量改进，用理解断点和任务表现指导补教与修订。</w:t>
       </w:r>
     </w:p>
@@ -926,11 +1272,17 @@
       </w:pPr>
       <w:r>
         <w:rPr>
+          <w:rFonts w:ascii="宋体" w:hAnsi="宋体" w:eastAsia="宋体"/>
           <w:b/>
+          <w:sz w:val="24"/>
         </w:rPr>
         <w:t>3．以三功能交叉验证检查应用与迁移。</w:t>
       </w:r>
       <w:r>
+        <w:rPr>
+          <w:rFonts w:ascii="宋体" w:hAnsi="宋体" w:eastAsia="宋体"/>
+          <w:sz w:val="24"/>
+        </w:rPr>
         <w:t>将带读、PPT和方案作为相互检验的材料，结合原始证据和变化条件，检查内容准确性、表达完整性与设计合理性。</w:t>
       </w:r>
     </w:p>
@@ -943,11 +1295,17 @@
       </w:pPr>
       <w:r>
         <w:rPr>
+          <w:rFonts w:ascii="宋体" w:hAnsi="宋体" w:eastAsia="宋体"/>
           <w:b/>
+          <w:sz w:val="24"/>
         </w:rPr>
         <w:t>4．以模块化Skill积累可复用能力。</w:t>
       </w:r>
       <w:r>
+        <w:rPr>
+          <w:rFonts w:ascii="宋体" w:hAnsi="宋体" w:eastAsia="宋体"/>
+          <w:sz w:val="24"/>
+        </w:rPr>
         <w:t>将反馈定位到独立模块，通过候选比较持续改进，兼顾教学质量、开发效率与后续扩展，形成可维护的科研学习智能体。</w:t>
       </w:r>
     </w:p>

</xml_diff>

<commit_message>
Tighten design statement for contest review
</commit_message>
<xml_diff>
--- a/docs/医研导师设计说明.docx
+++ b/docs/医研导师设计说明.docx
@@ -46,11 +46,7 @@
         <w:snapToGrid w:val="0"/>
       </w:pPr>
       <w:r>
-        <w:rPr>
-          <w:rFonts w:ascii="宋体" w:hAnsi="宋体" w:eastAsia="宋体"/>
-          <w:sz w:val="24"/>
-        </w:rPr>
-        <w:t>医学科研初学者进入课题组后，常从阅读论文开始接触科研。理解论文既需要跨越英文术语障碍，也需要认识研究背景、理解方法原理、读懂图表，并判断实验结果如何支持结论。缺少科研训练的学生，即使知道论文做了什么，也往往难以解释为什么这样做，更难将其中的思路用于自己的研究问题。</w:t>
+        <w:t>医学科研初学者读论文，难点不止是英文。更常见的断点是：看不懂研究问题与方法的关系，读不出图表中的证据，也说不清实验为什么这样设计、结论凭什么成立。于是“知道论文做了什么”，却难以解释“为什么这样做”，更难迁移到自己的课题。</w:t>
       </w:r>
     </w:p>
     <w:p>
@@ -60,11 +56,7 @@
         <w:snapToGrid w:val="0"/>
       </w:pPr>
       <w:r>
-        <w:rPr>
-          <w:rFonts w:ascii="宋体" w:hAnsi="宋体" w:eastAsia="宋体"/>
-          <w:sz w:val="24"/>
-        </w:rPr>
-        <w:t>医研导师面向本科大一至大五及研究生一年级阶段的医学科研初学者，以论文为学习载体，提供连续、可追问、可对照原文的科研学习支持。系统从研究背景、问题和价值切入，顺着论文展开，在关键实验、方法与图表处深入解释，将专业术语、对照设置、证据推理与研究局限融入具体情境，并允许用户调整讲解深浅。</w:t>
+        <w:t>医研导师面向本科低年级至研究生阶段的医学科研初学者，以学习过程为中心，提供从原文阅读、证据理解到研究设计的连续支持。系统按论文顺序带读，在关键处展开术语、图表、实验对照和结论推导，并根据用户的追问调整节奏和深度。</w:t>
       </w:r>
     </w:p>
     <w:p>
@@ -74,11 +66,7 @@
         <w:snapToGrid w:val="0"/>
       </w:pPr>
       <w:r>
-        <w:rPr>
-          <w:rFonts w:ascii="宋体" w:hAnsi="宋体" w:eastAsia="宋体"/>
-          <w:sz w:val="24"/>
-        </w:rPr>
-        <w:t>作品围绕三个相互关联的目标展开：读懂研究，理解问题、方法与证据之间的关系；讲清研究，能够组织汇报并解释结论依据；尝试设计，能够结合新问题与实际条件，思考方法选择、对照设置和结果解释。</w:t>
+        <w:t>作品围绕三个相互衔接的任务展开：把论文读懂，把研究讲清楚，把方法迁移到新的问题。用户可以用同一篇论文完成精读、汇报和方案构思，逐步形成理解证据、组织表达、设计实验和判断局限的科研能力。</w:t>
       </w:r>
     </w:p>
     <w:p>
@@ -88,11 +76,7 @@
         <w:snapToGrid w:val="0"/>
       </w:pPr>
       <w:r>
-        <w:rPr>
-          <w:rFonts w:ascii="宋体" w:hAnsi="宋体" w:eastAsia="宋体"/>
-          <w:sz w:val="24"/>
-        </w:rPr>
-        <w:t>为此，系统设置论文精读带学、科研汇报PPT生成和研究方案构思三条主线，以模块化Skill组织能力，通过多Agent协作开展教学、模拟学习和来源核验，并利用内部交叉验证持续改进教学与生成规则。</w:t>
+        <w:t>为此，系统设置论文带读、医学科研汇报 PPT、研究方案构思三条主线，由导师 Agent 统筹多个专门 Agent 和模块化 Skill。三条主线共享原文、证据和反馈，互相检查理解是否准确、表达是否完整、设计是否可行，并把结果用于后续修订。</w:t>
       </w:r>
     </w:p>
     <w:p>
@@ -387,11 +371,7 @@
         <w:snapToGrid w:val="0"/>
       </w:pPr>
       <w:r>
-        <w:rPr>
-          <w:rFonts w:ascii="宋体" w:hAnsi="宋体" w:eastAsia="宋体"/>
-          <w:sz w:val="24"/>
-        </w:rPr>
-        <w:t>调度器根据任务组合角色与Skill，汇总问题并组织修订、复读和复核，同时管理执行顺序、预算与运行记录。日常使用按需调用，内部迭代围绕具体问题运行完整验证流程。</w:t>
+        <w:t>调度器负责把任务分给合适的 Agent 和 Skill，安排执行顺序，保存来源与版本，并在需要时触发追问、修订和复核。各角色共享同一套证据标准，避免不同功能各说一套。</w:t>
       </w:r>
     </w:p>
     <w:p>
@@ -401,11 +381,7 @@
         <w:snapToGrid w:val="0"/>
       </w:pPr>
       <w:r>
-        <w:rPr>
-          <w:rFonts w:ascii="宋体" w:hAnsi="宋体" w:eastAsia="宋体"/>
-          <w:sz w:val="24"/>
-        </w:rPr>
-        <w:t>新手模拟围绕设定的学习基础和已接触材料展开，重点观察概念是否理解、推理能否衔接、结论能否解释。核验角色则依据原始材料检查作答，定位到具体语句、图件或实验条件。两类反馈汇总后，导师可以针对理解问题补充解释，针对证据问题修正表述，使修订具有明确目标。</w:t>
+        <w:t>新手模拟 Agent 从初学者视角检查：术语是否听得懂、段落是否连得上、图表和结论是否讲清、下一步是否明确。来源核验 Agent 回到原文、图表和数据，核对数字、条件、对照、结论边界和引用。导师 Agent 汇总两类反馈，补充关键解释并决定是否进入下一步。</w:t>
       </w:r>
     </w:p>
     <w:p>
@@ -430,11 +406,7 @@
         <w:snapToGrid w:val="0"/>
       </w:pPr>
       <w:r>
-        <w:rPr>
-          <w:rFonts w:ascii="宋体" w:hAnsi="宋体" w:eastAsia="宋体"/>
-          <w:sz w:val="24"/>
-        </w:rPr>
-        <w:t>论文带读、PPT和研究方案分别承载理解、表达与设计任务。内部迭代将三类产物与原始来源关联起来，检查证据一致性，并观察模拟新手能否使用材料完成任务。</w:t>
+        <w:t>带读生成 PPT 或讲稿时，系统反向检查材料是否保留了研究问题、实验设计、关键证据、结果和局限，是否能从原文找到依据。来源核验 Agent 检查图表、数字和引用；新手模拟 Agent 检查听众能否跟上；导师 Agent 负责重排叙事和补齐缺口。</w:t>
       </w:r>
     </w:p>
     <w:p>
@@ -444,11 +416,7 @@
         <w:snapToGrid w:val="0"/>
       </w:pPr>
       <w:r>
-        <w:rPr>
-          <w:rFonts w:ascii="宋体" w:hAnsi="宋体" w:eastAsia="宋体"/>
-          <w:sz w:val="24"/>
-        </w:rPr>
-        <w:t>例如，导师讲解某项实验后，系统生成对应汇报材料，再让模拟新手组织文字汇报提纲或讲述内容，解释实验目的、对照设置和结果依据。如果新手只能复述结论，却说不清比较组的作用，系统便回查带读是否遗漏了设计理由、PPT是否在压缩内容时删去了关键条件。导师据此补教或修订，再由新手重新作答、核验角色检查改善情况。</w:t>
+        <w:t>例如，某个实验被压缩成一句“结果更好”时，核验 Agent 会追查比较对象、指标和统计结果，新手模拟 Agent 会指出听众不知道“为什么做这个实验”，导师 Agent 再补回实验目的、对照关系和结论边界。这样 PPT 同时成为论文理解的检验材料。</w:t>
       </w:r>
     </w:p>
     <w:p>
@@ -458,11 +426,7 @@
         <w:snapToGrid w:val="0"/>
       </w:pPr>
       <w:r>
-        <w:rPr>
-          <w:rFonts w:ascii="宋体" w:hAnsi="宋体" w:eastAsia="宋体"/>
-          <w:sz w:val="24"/>
-        </w:rPr>
-        <w:t>这一过程同时检验汇报材料的表达效果与模拟新手的学习表现。汇报提纲等任务要求重新组织内容，以观察对研究主线和证据关系的掌握。PPT中暴露的问题可以反馈到带读，教学中的理解断点也能指导汇报材料改进。</w:t>
+        <w:t>汇报反馈既检查表达，也检查学习结果：能否按研究逻辑组织内容，能否把数据与结论对应起来，能否说明结果的适用范围。若讲述只停留在结论，系统会回到相应图表或实验段落进行补读。</w:t>
       </w:r>
     </w:p>
     <w:p>
@@ -472,11 +436,7 @@
         <w:snapToGrid w:val="0"/>
       </w:pPr>
       <w:r>
-        <w:rPr>
-          <w:rFonts w:ascii="宋体" w:hAnsi="宋体" w:eastAsia="宋体"/>
-          <w:sz w:val="24"/>
-        </w:rPr>
-        <w:t>交叉检查还关注成果转换中的信息损失。例如，带读已经解释了研究对象的适用范围，汇报页面在提炼结论时也需要保留这一条件；研究方案借鉴相关方法时，则需重新判断其是否适合新的对象和资源。三个功能由此共享证据要求，同时分别承担理解、表达和应用的检验任务。</w:t>
+        <w:t>迁移检查关注知识能否离开原论文继续使用。系统会改变研究对象、数据来源或资源条件，要求用户重新判断研究问题、对照、指标和方法是否仍然成立；不成立时说明原因，并引导寻找替代设计。</w:t>
       </w:r>
     </w:p>
     <w:p>
@@ -501,11 +461,7 @@
         <w:snapToGrid w:val="0"/>
       </w:pPr>
       <w:r>
-        <w:rPr>
-          <w:rFonts w:ascii="宋体" w:hAnsi="宋体" w:eastAsia="宋体"/>
-          <w:sz w:val="24"/>
-        </w:rPr>
-        <w:t>内部流程进一步改变研究人群、可用资源、观察时间或结局条件，让模拟新手尝试形成新的研究设计。</w:t>
+        <w:t>在研究方案任务中，系统把论文中的证据链拆成可迁移的设计要素，再放入新的问题和限制条件中重新组合。</w:t>
       </w:r>
     </w:p>
     <w:p>
@@ -515,11 +471,7 @@
         <w:snapToGrid w:val="0"/>
       </w:pPr>
       <w:r>
-        <w:rPr>
-          <w:rFonts w:ascii="宋体" w:hAnsi="宋体" w:eastAsia="宋体"/>
-          <w:sz w:val="24"/>
-        </w:rPr>
-        <w:t>例如，原论文使用长期随访数据，新任务只有一次体检记录，新手就需要重新考虑可回答的问题、变量的时间关系与结论范围。核验角色结合新条件评价设计；发现机械照搬原研究的情况后，导师围绕相应方法和证据问题补教，再开展复验。</w:t>
+        <w:t>例如，原研究依赖连续随访数据，而新课题只有一次住院记录，系统会要求重新考虑可回答的问题、结局定义、时间顺序和混杂控制，避免把原论文的方法直接照搬。</w:t>
       </w:r>
     </w:p>
     <w:p>
@@ -529,11 +481,7 @@
         <w:snapToGrid w:val="0"/>
       </w:pPr>
       <w:r>
-        <w:rPr>
-          <w:rFonts w:ascii="宋体" w:hAnsi="宋体" w:eastAsia="宋体"/>
-          <w:sz w:val="24"/>
-        </w:rPr>
-        <w:t>方案中的困难也会反馈到带读与汇报：方法条件是否讲清、关键限制是否保留、概念能否用于新情境，都成为后续优化的依据。</w:t>
+        <w:t>同样的迁移检查也会回到 PPT 和带读结果：如果用户能讲清原实验，却无法解释方法换到新场景后的变化，导师 Agent 会定位缺口并安排针对性复读。</w:t>
       </w:r>
     </w:p>
     <w:p>
@@ -558,11 +506,7 @@
         <w:snapToGrid w:val="0"/>
       </w:pPr>
       <w:r>
-        <w:rPr>
-          <w:rFonts w:ascii="宋体" w:hAnsi="宋体" w:eastAsia="宋体"/>
-          <w:sz w:val="24"/>
-        </w:rPr>
-        <w:t>内部闭环按照“生成产物—交叉核验—新手作答—补教修订—复验与迁移”展开。跨产物核验关联原始来源，检查事实、实验条件、图件和结论的表达，并区分已有研究结果与新方案假设。</w:t>
+        <w:t>内部迭代采用“生成—模拟—核验—修订—迁移复测”的循环。生成结果后，由新手模拟 Agent 检查可理解性，由来源核验 Agent 检查证据一致性，再由导师 Agent 统一修改；随后用另一条主线复测，观察修改是否真正改善了理解和设计。</w:t>
       </w:r>
     </w:p>
     <w:p>
@@ -572,11 +516,7 @@
         <w:snapToGrid w:val="0"/>
       </w:pPr>
       <w:r>
-        <w:rPr>
-          <w:rFonts w:ascii="宋体" w:hAnsi="宋体" w:eastAsia="宋体"/>
-          <w:sz w:val="24"/>
-        </w:rPr>
-        <w:t>迭代结合小样本与完整论文：小样本快速定位术语、读图和对照理解等问题；完整论文检查讲解连贯性与汇报逻辑；跨功能任务检查表达和设计中的应用表现。内部迭代主要优化Skill、提示规则与协作流程，改进候选经比较验证后用于后续服务。完整交叉流程主要用于内部质量迭代，用户可按当前需求使用单项功能。</w:t>
+        <w:t>测试既使用完整论文，也使用小样本片段。小样本用于快速定位术语、图表、引用和流程问题，完整论文用于检查长链条的一致性。PPT、研究方案和带读互相作为测试材料：带读检验理解，PPT检验表达，方案检验迁移。</w:t>
       </w:r>
     </w:p>
     <w:p>
@@ -586,11 +526,7 @@
         <w:snapToGrid w:val="0"/>
       </w:pPr>
       <w:r>
-        <w:rPr>
-          <w:rFonts w:ascii="宋体" w:hAnsi="宋体" w:eastAsia="宋体"/>
-          <w:sz w:val="24"/>
-        </w:rPr>
-        <w:t>每轮比较保留材料、规则版本、模型配置与运行记录，将当前规则作为基线，将修改后的规则作为候选。候选规则在独立快照中验证，评价内容与作答所需材料分开组织，减少答案提示对模拟表现的影响。通过比较与发布检查后，采用的规则才进入实际服务，使局部调整有据可查，也便于发现改善是否伴随其他能力退步。</w:t>
+        <w:t>每轮保留输入、输出、核验意见和修改结果，比较修订前后的缺口数量与严重程度。对事实错误、证据错配、关键步骤缺失等问题严格处理；对不影响理解的措辞和排版问题集中归并，控制迭代成本。</w:t>
       </w:r>
     </w:p>
     <w:p>
@@ -897,11 +833,7 @@
         <w:snapToGrid w:val="0"/>
       </w:pPr>
       <w:r>
-        <w:rPr>
-          <w:rFonts w:ascii="宋体" w:hAnsi="宋体" w:eastAsia="宋体"/>
-          <w:sz w:val="24"/>
-        </w:rPr>
-        <w:t>Skill与Agent采用灵活的组合关系。例如，导师解释实验图时，可组合图表教学、方法教学和证据链；制作汇报时，再调用PPT模块。共同的核验规则使不同成果在事实与推理要求上保持一致。</w:t>
+        <w:t>Skill 与 Agent 按职责组合而非彼此孤立。例如讲解实验图表时调用图表解析、证据核验和医学术语 Skill；生成汇报时再调用 PPT 组织与讲稿 Skill。相同的证据和教学规则贯穿三条主线，保证读到、讲到、设计到的内容一致。</w:t>
       </w:r>
     </w:p>
     <w:p>
@@ -926,11 +858,7 @@
         <w:snapToGrid w:val="0"/>
       </w:pPr>
       <w:r>
-        <w:rPr>
-          <w:rFonts w:ascii="宋体" w:hAnsi="宋体" w:eastAsia="宋体"/>
-          <w:sz w:val="24"/>
-        </w:rPr>
-        <w:t>模块化使反馈能够定位到具体能力：对照理解困难可以调整方法教学，PPT遗漏条件可以优化汇报与证据链，方案忽略资源限制可以改进条件分析规则。候选版本在相同材料与任务上进行比较，再通过完整论文和跨功能任务检查整体表现。</w:t>
+        <w:t>模块化让问题可以被定位到具体环节：图表解释不足时改进图表 Skill，PPT 逻辑松散时改进汇报 Skill，方案缺少对照时改进研究设计或核验 Skill。单个模块可以单独测试和替换，减少重复开发，也便于迁移到不同模型或运行环境。</w:t>
       </w:r>
     </w:p>
     <w:p>
@@ -940,11 +868,7 @@
         <w:snapToGrid w:val="0"/>
       </w:pPr>
       <w:r>
-        <w:rPr>
-          <w:rFonts w:ascii="宋体" w:hAnsi="宋体" w:eastAsia="宋体"/>
-          <w:sz w:val="24"/>
-        </w:rPr>
-        <w:t>共享模块减少重复编写规则的工作，局部修改缩短问题定位、调整与验证的路径。扩展医学方向或适配其他模型时，可以复用现有框架，集中调整相关模块与接入配置，使有限的开发时间和迭代资源用于改善具体能力。</w:t>
+        <w:t>共享的输入输出约定使模块能够复用同一份证据、引用和版本记录。开发者可以先用小样本验证局部改动，再用完整论文检查跨功能影响，把有限时间集中在真正影响质量的环节。</w:t>
       </w:r>
     </w:p>
     <w:p>
@@ -954,11 +878,7 @@
         <w:snapToGrid w:val="0"/>
       </w:pPr>
       <w:r>
-        <w:rPr>
-          <w:rFonts w:ascii="宋体" w:hAnsi="宋体" w:eastAsia="宋体"/>
-          <w:sz w:val="24"/>
-        </w:rPr>
-        <w:t>共享规则负责不同任务都需要遵循的教学和证据原则，各Skill补充具体任务的方法与输出要求。这种分层使共同要求能够统一维护，任务差异能够分别优化，也便于检查一次规则变更会影响哪些功能。</w:t>
+        <w:t>模块化还降低维护成本：公共规则只需维护一次，专门能力可以独立演进，调度器负责组合而不是重复实现细节。这样既能快速试错，也能保留可追溯的稳定版本。</w:t>
       </w:r>
     </w:p>
     <w:p>
@@ -1167,11 +1087,7 @@
         <w:snapToGrid w:val="0"/>
       </w:pPr>
       <w:r>
-        <w:rPr>
-          <w:rFonts w:ascii="宋体" w:hAnsi="宋体" w:eastAsia="宋体"/>
-          <w:sz w:val="24"/>
-        </w:rPr>
-        <w:t>项目建立工程回归、使用流程和内部协作三类验证。工程回归检查数据、调度、导出等行为，并开展类型检查、构建与自动化测试；使用流程验证串联导入、带读、追问、图表对照及成果生成；内部协作验证结合模拟作答与交叉核验，比较规则表现。</w:t>
+        <w:t>验证分为三层：工程测试检查页面、接口、文件和导出流程；内部模拟检查三 Agent 的协作、三主线交叉验证和迁移能力；用户体验检查关注阅读节奏、追问方式、版式和可操作性。三层结果分别记录，避免把自动化通过误写成真实用户成效。</w:t>
       </w:r>
     </w:p>
     <w:p>
@@ -1181,11 +1097,7 @@
         <w:snapToGrid w:val="0"/>
       </w:pPr>
       <w:r>
-        <w:rPr>
-          <w:rFonts w:ascii="宋体" w:hAnsi="宋体" w:eastAsia="宋体"/>
-          <w:sz w:val="24"/>
-        </w:rPr>
-        <w:t>内部学习评价设置“未学习”“仅阅读材料”“材料加教学”等条件，为分析教学带来的帮助提供比较依据。项目已围绕阅读连续性、图件来源、PPT排版、方案条件保留、角色可见材料和补教复验等环节开展优化，将反馈落实到教学规则与执行流程。</w:t>
+        <w:t>内部样本覆盖论文片段、完整论文、图表、PPT、研究方案和独立讲述。测试重点包括：能否定位原文、能否保留关键证据、能否发现明显设计错误、能否根据反馈完成修订，以及修改后能否迁移到新条件。</w:t>
       </w:r>
     </w:p>
     <w:p>
@@ -1195,11 +1107,7 @@
         <w:snapToGrid w:val="0"/>
       </w:pPr>
       <w:r>
-        <w:rPr>
-          <w:rFonts w:ascii="宋体" w:hAnsi="宋体" w:eastAsia="宋体"/>
-          <w:sz w:val="24"/>
-        </w:rPr>
-        <w:t>质量评价同时考虑科学准确性与学习体验。事实失实、关键条件遗漏和图件不对应等问题作为重点处理对象；讲解则关注层次、长度和可理解性，PPT关注图文布局与汇报节奏，方案关注条件完整性与设计理由。内部比较采用较细的检查维度，日常交付优先解决影响理解和使用的实质性问题，兼顾稳定性与效率。</w:t>
+        <w:t>质量判断优先处理事实错误、关键证据遗漏、结论越界和实验设计缺口；对不影响主要理解的小问题进行合并修订。当前结果反映的是工程测试和内部模拟核验，不替代真实课堂或临床使用评价。</w:t>
       </w:r>
     </w:p>
     <w:p>

</xml_diff>